<commit_message>
Perbaiki bagian Dasar Penugasan di template SPPD: edit langsung XML template (teks statis contoh MGMP dihapus, diganti 1 placeholder $dasarkalimat), tambah field form Isian Surat Undangan + Tanggal/Nomor Surat Undangan (opsional) - kalimat dasar dihitung otomatis (lengkap kalau tanggal/nomor diisi, dipersingkat kalau kosong). Fix bug tanda kurung ganda pada jam selesai kosong.
</commit_message>
<xml_diff>
--- a/resources/templates/sppd_template.docx
+++ b/resources/templates/sppd_template.docx
@@ -853,195 +853,7 @@
           <w:szCs w:val="24"/>
           <w:lang w:val="id-ID"/>
         </w:rPr>
-        <w:t xml:space="preserve">  </w:t>
-      </w:r>
-      <w:r>
-        <w:rPr>
-          <w:rFonts w:ascii="Times New Roman" w:hAnsi="Times New Roman"/>
-          <w:sz w:val="24"/>
-          <w:szCs w:val="24"/>
-          <w:lang w:val="id-ID"/>
-        </w:rPr>
-        <w:t>Berdasarkan surat undangan</w:t>
-      </w:r>
-      <w:r>
-        <w:rPr>
-          <w:rFonts w:ascii="Times New Roman" w:hAnsi="Times New Roman"/>
-          <w:sz w:val="24"/>
-          <w:szCs w:val="24"/>
-          <w:lang w:val="id-ID"/>
-        </w:rPr>
-        <w:t xml:space="preserve"> MGMP Kabupaten Malang Mapel Informatika </w:t>
-      </w:r>
-      <w:r>
-        <w:rPr>
-          <w:rFonts w:ascii="Times New Roman" w:hAnsi="Times New Roman"/>
-          <w:sz w:val="24"/>
-          <w:szCs w:val="24"/>
-          <w:lang w:val="id-ID"/>
-        </w:rPr>
-        <w:t xml:space="preserve">  </w:t>
-      </w:r>
-    </w:p>
-    <w:p>
-      <w:pPr>
-        <w:spacing w:after="0" w:line="240" w:lineRule="auto"/>
-        <w:ind w:left="2160"/>
-        <w:jc w:val="both"/>
-        <w:rPr>
-          <w:rFonts w:ascii="Times New Roman" w:hAnsi="Times New Roman"/>
-          <w:sz w:val="24"/>
-          <w:szCs w:val="24"/>
-          <w:lang w:val="id-ID"/>
-        </w:rPr>
-      </w:pPr>
-      <w:r>
-        <w:rPr>
-          <w:rFonts w:ascii="Times New Roman" w:hAnsi="Times New Roman"/>
-          <w:sz w:val="24"/>
-          <w:szCs w:val="24"/>
-          <w:lang w:val="id-ID"/>
-        </w:rPr>
-        <w:t xml:space="preserve">   dan KKA (MGMP IFKKA),</w:t>
-      </w:r>
-      <w:r>
-        <w:rPr>
-          <w:rFonts w:ascii="Times New Roman" w:hAnsi="Times New Roman"/>
-          <w:sz w:val="24"/>
-          <w:szCs w:val="24"/>
-          <w:lang w:val="id-ID"/>
-        </w:rPr>
-        <w:t xml:space="preserve"> </w:t>
-      </w:r>
-      <w:r>
-        <w:rPr>
-          <w:rFonts w:ascii="Times New Roman" w:hAnsi="Times New Roman"/>
-          <w:sz w:val="24"/>
-          <w:szCs w:val="24"/>
-          <w:lang w:val="id-ID"/>
-        </w:rPr>
-        <w:t xml:space="preserve">pada tanggal </w:t>
-      </w:r>
-      <w:r>
-        <w:rPr>
-          <w:rFonts w:ascii="Times New Roman" w:hAnsi="Times New Roman"/>
-          <w:sz w:val="24"/>
-          <w:szCs w:val="24"/>
-          <w:lang w:val="id-ID"/>
-        </w:rPr>
-        <w:t>9</w:t>
-      </w:r>
-      <w:r>
-        <w:rPr>
-          <w:rFonts w:ascii="Times New Roman" w:hAnsi="Times New Roman"/>
-          <w:sz w:val="24"/>
-          <w:szCs w:val="24"/>
-          <w:lang w:val="id-ID"/>
-        </w:rPr>
-        <w:t xml:space="preserve"> </w:t>
-      </w:r>
-      <w:r>
-        <w:rPr>
-          <w:rFonts w:ascii="Times New Roman" w:hAnsi="Times New Roman"/>
-          <w:sz w:val="24"/>
-          <w:szCs w:val="24"/>
-          <w:lang w:val="id-ID"/>
-        </w:rPr>
-        <w:t xml:space="preserve">Juli </w:t>
-      </w:r>
-      <w:r>
-        <w:rPr>
-          <w:rFonts w:ascii="Times New Roman" w:hAnsi="Times New Roman"/>
-          <w:sz w:val="24"/>
-          <w:szCs w:val="24"/>
-          <w:lang w:val="id-ID"/>
-        </w:rPr>
-        <w:t>202</w:t>
-      </w:r>
-      <w:r>
-        <w:rPr>
-          <w:rFonts w:ascii="Times New Roman" w:hAnsi="Times New Roman"/>
-          <w:sz w:val="24"/>
-          <w:szCs w:val="24"/>
-          <w:lang w:val="id-ID"/>
-        </w:rPr>
-        <w:t xml:space="preserve">6, </w:t>
-      </w:r>
-      <w:r>
-        <w:rPr>
-          <w:rFonts w:ascii="Times New Roman" w:hAnsi="Times New Roman"/>
-          <w:sz w:val="24"/>
-          <w:szCs w:val="24"/>
-          <w:lang w:val="id-ID"/>
-        </w:rPr>
-        <w:t xml:space="preserve">No. </w:t>
-      </w:r>
-      <w:r>
-        <w:rPr>
-          <w:rFonts w:ascii="Times New Roman" w:hAnsi="Times New Roman"/>
-          <w:sz w:val="24"/>
-          <w:szCs w:val="24"/>
-          <w:lang w:val="id-ID"/>
-        </w:rPr>
-        <w:t>02//012/FKKA-</w:t>
-      </w:r>
-    </w:p>
-    <w:p>
-      <w:pPr>
-        <w:spacing w:after="0" w:line="240" w:lineRule="auto"/>
-        <w:ind w:left="1440" w:firstLine="720"/>
-        <w:jc w:val="both"/>
-        <w:rPr>
-          <w:rFonts w:ascii="Times New Roman" w:hAnsi="Times New Roman"/>
-          <w:sz w:val="24"/>
-          <w:szCs w:val="24"/>
-          <w:lang w:val="id-ID"/>
-        </w:rPr>
-      </w:pPr>
-      <w:r>
-        <w:rPr>
-          <w:rFonts w:ascii="Times New Roman" w:hAnsi="Times New Roman"/>
-          <w:sz w:val="24"/>
-          <w:szCs w:val="24"/>
-          <w:lang w:val="id-ID"/>
-        </w:rPr>
-        <w:t xml:space="preserve">   SMP.KABmlg/VII/2026</w:t>
-      </w:r>
-      <w:r>
-        <w:rPr>
-          <w:rFonts w:ascii="Times New Roman" w:hAnsi="Times New Roman"/>
-          <w:sz w:val="24"/>
-          <w:szCs w:val="24"/>
-          <w:lang w:val="id-ID"/>
-        </w:rPr>
-        <w:t xml:space="preserve"> perihal </w:t>
-      </w:r>
-      <w:r>
-        <w:rPr>
-          <w:rFonts w:ascii="Times New Roman" w:hAnsi="Times New Roman"/>
-          <w:sz w:val="24"/>
-          <w:szCs w:val="24"/>
-          <w:lang w:val="id-ID"/>
-        </w:rPr>
-        <w:t>undangan pertemua rutin</w:t>
-      </w:r>
-      <w:r>
-        <w:rPr>
-          <w:rFonts w:ascii="Times New Roman" w:hAnsi="Times New Roman"/>
-          <w:sz w:val="24"/>
-          <w:szCs w:val="24"/>
-          <w:lang w:val="id-ID"/>
-        </w:rPr>
-        <w:t xml:space="preserve"> maka</w:t>
-      </w:r>
-      <w:r>
-        <w:rPr>
-          <w:rFonts w:ascii="Times New Roman" w:hAnsi="Times New Roman"/>
-          <w:sz w:val="24"/>
-          <w:szCs w:val="24"/>
-          <w:lang w:val="id-ID"/>
-        </w:rPr>
-        <w:t>:</w:t>
+        <w:t xml:space="preserve"> $dasarkalimat</w:t>
       </w:r>
     </w:p>
     <w:p>

</xml_diff>

<commit_message>
Pasang template SPPD versi tabel yang baru (lebih rapi/lurus). Perbaiki DocxMergeService: mekanisme penggantian placeholder yang terpecah lintas <w:t> (akibat spell-check Word dll) sekarang jauh lebih aman - cuma mengubah isi teks di dalam tag yang sudah ada, tidak pernah menghapus/gabung tag sendiri, sudah diuji tidak merusak struktur XML baik di template lama maupun baru. Update mapping data ke placeholder baru ($deskrpsi, $noundangan).
</commit_message>
<xml_diff>
--- a/resources/templates/sppd_template.docx
+++ b/resources/templates/sppd_template.docx
@@ -475,7 +475,23 @@
                 <w:rFonts w:ascii="Times New Roman" w:hAnsi="Times New Roman"/>
                 <w:color w:val="000000"/>
               </w:rPr>
-              <w:t xml:space="preserve">Jalan Panglima Sudirman </w:t>
+              <w:t xml:space="preserve">Jalan </w:t>
+            </w:r>
+            <w:proofErr w:type="spellStart"/>
+            <w:r>
+              <w:rPr>
+                <w:rFonts w:ascii="Times New Roman" w:hAnsi="Times New Roman"/>
+                <w:color w:val="000000"/>
+              </w:rPr>
+              <w:t>Panglima</w:t>
+            </w:r>
+            <w:proofErr w:type="spellEnd"/>
+            <w:r>
+              <w:rPr>
+                <w:rFonts w:ascii="Times New Roman" w:hAnsi="Times New Roman"/>
+                <w:color w:val="000000"/>
+              </w:rPr>
+              <w:t xml:space="preserve"> Sudirman </w:t>
             </w:r>
             <w:r>
               <w:rPr>
@@ -515,7 +531,23 @@
                 <w:rFonts w:ascii="Times New Roman" w:hAnsi="Times New Roman"/>
                 <w:color w:val="000000"/>
               </w:rPr>
-              <w:t xml:space="preserve"> Telepon </w:t>
+              <w:t xml:space="preserve"> </w:t>
+            </w:r>
+            <w:proofErr w:type="spellStart"/>
+            <w:r>
+              <w:rPr>
+                <w:rFonts w:ascii="Times New Roman" w:hAnsi="Times New Roman"/>
+                <w:color w:val="000000"/>
+              </w:rPr>
+              <w:t>Telepon</w:t>
+            </w:r>
+            <w:proofErr w:type="spellEnd"/>
+            <w:r>
+              <w:rPr>
+                <w:rFonts w:ascii="Times New Roman" w:hAnsi="Times New Roman"/>
+                <w:color w:val="000000"/>
+              </w:rPr>
+              <w:t xml:space="preserve"> </w:t>
             </w:r>
             <w:r>
               <w:rPr>
@@ -763,9 +795,7 @@
         <w:ind w:left="1440" w:firstLine="720"/>
         <w:rPr>
           <w:rFonts w:ascii="Times New Roman" w:hAnsi="Times New Roman"/>
-          <w:sz w:val="24"/>
-          <w:szCs w:val="24"/>
-          <w:lang w:val="id-ID"/>
+          <w:lang w:val="sv-SE"/>
         </w:rPr>
       </w:pPr>
       <w:r>
@@ -809,6 +839,1215 @@
         <w:ind w:left="1440" w:firstLine="720"/>
         <w:rPr>
           <w:rFonts w:ascii="Times New Roman" w:hAnsi="Times New Roman"/>
+          <w:lang w:val="sv-SE"/>
+        </w:rPr>
+      </w:pPr>
+    </w:p>
+    <w:tbl>
+      <w:tblPr>
+        <w:tblStyle w:val="TableGrid"/>
+        <w:tblW w:w="0" w:type="auto"/>
+        <w:tblInd w:w="720" w:type="dxa"/>
+        <w:tblBorders>
+          <w:top w:val="none" w:sz="0" w:space="0" w:color="auto"/>
+          <w:left w:val="none" w:sz="0" w:space="0" w:color="auto"/>
+          <w:bottom w:val="none" w:sz="0" w:space="0" w:color="auto"/>
+          <w:right w:val="none" w:sz="0" w:space="0" w:color="auto"/>
+          <w:insideH w:val="none" w:sz="0" w:space="0" w:color="auto"/>
+          <w:insideV w:val="none" w:sz="0" w:space="0" w:color="auto"/>
+        </w:tblBorders>
+        <w:tblLook w:val="04A0" w:firstRow="1" w:lastRow="0" w:firstColumn="1" w:lastColumn="0" w:noHBand="0" w:noVBand="1"/>
+      </w:tblPr>
+      <w:tblGrid>
+        <w:gridCol w:w="1427"/>
+        <w:gridCol w:w="283"/>
+        <w:gridCol w:w="1950"/>
+        <w:gridCol w:w="283"/>
+        <w:gridCol w:w="5301"/>
+      </w:tblGrid>
+      <w:tr>
+        <w:tc>
+          <w:tcPr>
+            <w:tcW w:w="1427" w:type="dxa"/>
+          </w:tcPr>
+          <w:p>
+            <w:pPr>
+              <w:spacing w:after="0"/>
+              <w:rPr>
+                <w:rFonts w:ascii="Times New Roman" w:hAnsi="Times New Roman"/>
+                <w:sz w:val="24"/>
+                <w:szCs w:val="24"/>
+                <w:lang w:val="id-ID"/>
+              </w:rPr>
+            </w:pPr>
+            <w:r>
+              <w:rPr>
+                <w:rFonts w:ascii="Times New Roman" w:hAnsi="Times New Roman"/>
+                <w:sz w:val="24"/>
+                <w:szCs w:val="24"/>
+                <w:lang w:val="id-ID"/>
+              </w:rPr>
+              <w:t>Dasar</w:t>
+            </w:r>
+          </w:p>
+        </w:tc>
+        <w:tc>
+          <w:tcPr>
+            <w:tcW w:w="283" w:type="dxa"/>
+          </w:tcPr>
+          <w:p>
+            <w:pPr>
+              <w:spacing w:after="0"/>
+              <w:rPr>
+                <w:rFonts w:ascii="Times New Roman" w:hAnsi="Times New Roman"/>
+                <w:sz w:val="24"/>
+                <w:szCs w:val="24"/>
+              </w:rPr>
+            </w:pPr>
+            <w:r>
+              <w:rPr>
+                <w:rFonts w:ascii="Times New Roman" w:hAnsi="Times New Roman"/>
+                <w:sz w:val="24"/>
+                <w:szCs w:val="24"/>
+              </w:rPr>
+              <w:t>:</w:t>
+            </w:r>
+          </w:p>
+        </w:tc>
+        <w:tc>
+          <w:tcPr>
+            <w:tcW w:w="7534" w:type="dxa"/>
+            <w:gridSpan w:val="3"/>
+          </w:tcPr>
+          <w:p>
+            <w:pPr>
+              <w:spacing w:after="0"/>
+              <w:rPr>
+                <w:rFonts w:ascii="Times New Roman" w:hAnsi="Times New Roman"/>
+                <w:sz w:val="24"/>
+                <w:szCs w:val="24"/>
+                <w:lang w:val="id-ID"/>
+              </w:rPr>
+            </w:pPr>
+            <w:r>
+              <w:rPr>
+                <w:rFonts w:ascii="Times New Roman" w:hAnsi="Times New Roman"/>
+                <w:sz w:val="24"/>
+                <w:szCs w:val="24"/>
+                <w:lang w:val="id-ID"/>
+              </w:rPr>
+              <w:t>Berdasarkan surat undangan $deskrpsi pada tanggal 9 Juli 2026, $noundangan perihal undangan pertemuan rutin maka:</w:t>
+            </w:r>
+          </w:p>
+        </w:tc>
+      </w:tr>
+      <w:tr>
+        <w:tc>
+          <w:tcPr>
+            <w:tcW w:w="9244" w:type="dxa"/>
+            <w:gridSpan w:val="5"/>
+          </w:tcPr>
+          <w:p>
+            <w:pPr>
+              <w:spacing w:before="360" w:after="240"/>
+              <w:ind w:firstLine="720"/>
+              <w:jc w:val="center"/>
+              <w:rPr>
+                <w:rFonts w:ascii="Times New Roman" w:hAnsi="Times New Roman"/>
+                <w:b/>
+                <w:sz w:val="24"/>
+                <w:szCs w:val="24"/>
+                <w:lang w:val="id-ID"/>
+              </w:rPr>
+            </w:pPr>
+            <w:r>
+              <w:rPr>
+                <w:rFonts w:ascii="Times New Roman" w:hAnsi="Times New Roman"/>
+                <w:b/>
+                <w:sz w:val="24"/>
+                <w:szCs w:val="24"/>
+                <w:lang w:val="id-ID"/>
+              </w:rPr>
+              <w:t>ME</w:t>
+            </w:r>
+            <w:r>
+              <w:rPr>
+                <w:rFonts w:ascii="Times New Roman" w:hAnsi="Times New Roman"/>
+                <w:b/>
+                <w:sz w:val="24"/>
+                <w:szCs w:val="24"/>
+                <w:lang w:val="id-ID"/>
+              </w:rPr>
+              <w:t>MERINTAHKAN</w:t>
+            </w:r>
+            <w:r>
+              <w:rPr>
+                <w:rFonts w:ascii="Times New Roman" w:hAnsi="Times New Roman"/>
+                <w:b/>
+                <w:sz w:val="24"/>
+                <w:szCs w:val="24"/>
+                <w:lang w:val="id-ID"/>
+              </w:rPr>
+              <w:t>:</w:t>
+            </w:r>
+          </w:p>
+          <w:p>
+            <w:pPr>
+              <w:spacing w:after="0"/>
+              <w:rPr>
+                <w:rFonts w:ascii="Times New Roman" w:hAnsi="Times New Roman"/>
+                <w:sz w:val="24"/>
+                <w:szCs w:val="24"/>
+                <w:lang w:val="id-ID"/>
+              </w:rPr>
+            </w:pPr>
+          </w:p>
+        </w:tc>
+      </w:tr>
+      <w:tr>
+        <w:tc>
+          <w:tcPr>
+            <w:tcW w:w="1427" w:type="dxa"/>
+          </w:tcPr>
+          <w:p>
+            <w:pPr>
+              <w:spacing w:after="0"/>
+              <w:rPr>
+                <w:rFonts w:ascii="Times New Roman" w:hAnsi="Times New Roman"/>
+                <w:sz w:val="24"/>
+                <w:szCs w:val="24"/>
+              </w:rPr>
+            </w:pPr>
+            <w:proofErr w:type="spellStart"/>
+            <w:r>
+              <w:rPr>
+                <w:rFonts w:ascii="Times New Roman" w:hAnsi="Times New Roman"/>
+                <w:sz w:val="24"/>
+                <w:szCs w:val="24"/>
+              </w:rPr>
+              <w:t>Kepada</w:t>
+            </w:r>
+            <w:proofErr w:type="spellEnd"/>
+          </w:p>
+        </w:tc>
+        <w:tc>
+          <w:tcPr>
+            <w:tcW w:w="283" w:type="dxa"/>
+          </w:tcPr>
+          <w:p>
+            <w:pPr>
+              <w:spacing w:after="0"/>
+              <w:rPr>
+                <w:rFonts w:ascii="Times New Roman" w:hAnsi="Times New Roman"/>
+                <w:sz w:val="24"/>
+                <w:szCs w:val="24"/>
+              </w:rPr>
+            </w:pPr>
+            <w:r>
+              <w:rPr>
+                <w:rFonts w:ascii="Times New Roman" w:hAnsi="Times New Roman"/>
+                <w:sz w:val="24"/>
+                <w:szCs w:val="24"/>
+              </w:rPr>
+              <w:t>:</w:t>
+            </w:r>
+          </w:p>
+        </w:tc>
+        <w:tc>
+          <w:tcPr>
+            <w:tcW w:w="1950" w:type="dxa"/>
+          </w:tcPr>
+          <w:p>
+            <w:pPr>
+              <w:spacing w:after="0"/>
+              <w:rPr>
+                <w:rFonts w:ascii="Times New Roman" w:hAnsi="Times New Roman"/>
+                <w:sz w:val="24"/>
+                <w:szCs w:val="24"/>
+              </w:rPr>
+            </w:pPr>
+            <w:r>
+              <w:rPr>
+                <w:rFonts w:ascii="Times New Roman" w:hAnsi="Times New Roman"/>
+                <w:sz w:val="24"/>
+                <w:szCs w:val="24"/>
+              </w:rPr>
+              <w:t>Nama</w:t>
+            </w:r>
+          </w:p>
+        </w:tc>
+        <w:tc>
+          <w:tcPr>
+            <w:tcW w:w="283" w:type="dxa"/>
+          </w:tcPr>
+          <w:p>
+            <w:pPr>
+              <w:spacing w:after="0"/>
+              <w:rPr>
+                <w:rFonts w:ascii="Times New Roman" w:hAnsi="Times New Roman"/>
+                <w:sz w:val="24"/>
+                <w:szCs w:val="24"/>
+              </w:rPr>
+            </w:pPr>
+            <w:r>
+              <w:rPr>
+                <w:rFonts w:ascii="Times New Roman" w:hAnsi="Times New Roman"/>
+                <w:sz w:val="24"/>
+                <w:szCs w:val="24"/>
+              </w:rPr>
+              <w:t>:</w:t>
+            </w:r>
+          </w:p>
+        </w:tc>
+        <w:tc>
+          <w:tcPr>
+            <w:tcW w:w="5301" w:type="dxa"/>
+          </w:tcPr>
+          <w:p>
+            <w:pPr>
+              <w:spacing w:after="0"/>
+              <w:rPr>
+                <w:rFonts w:ascii="Times New Roman" w:hAnsi="Times New Roman"/>
+                <w:sz w:val="24"/>
+                <w:szCs w:val="24"/>
+              </w:rPr>
+            </w:pPr>
+            <w:r>
+              <w:rPr>
+                <w:rFonts w:ascii="Times New Roman" w:hAnsi="Times New Roman"/>
+                <w:sz w:val="24"/>
+                <w:szCs w:val="24"/>
+              </w:rPr>
+              <w:t>$</w:t>
+            </w:r>
+            <w:proofErr w:type="spellStart"/>
+            <w:r>
+              <w:rPr>
+                <w:rFonts w:ascii="Times New Roman" w:hAnsi="Times New Roman"/>
+                <w:sz w:val="24"/>
+                <w:szCs w:val="24"/>
+              </w:rPr>
+              <w:t>namaguru</w:t>
+            </w:r>
+            <w:proofErr w:type="spellEnd"/>
+          </w:p>
+        </w:tc>
+      </w:tr>
+      <w:tr>
+        <w:tc>
+          <w:tcPr>
+            <w:tcW w:w="1427" w:type="dxa"/>
+          </w:tcPr>
+          <w:p>
+            <w:pPr>
+              <w:spacing w:after="0"/>
+              <w:rPr>
+                <w:rFonts w:ascii="Times New Roman" w:hAnsi="Times New Roman"/>
+                <w:sz w:val="24"/>
+                <w:szCs w:val="24"/>
+              </w:rPr>
+            </w:pPr>
+          </w:p>
+        </w:tc>
+        <w:tc>
+          <w:tcPr>
+            <w:tcW w:w="283" w:type="dxa"/>
+          </w:tcPr>
+          <w:p>
+            <w:pPr>
+              <w:spacing w:after="0"/>
+              <w:rPr>
+                <w:rFonts w:ascii="Times New Roman" w:hAnsi="Times New Roman"/>
+                <w:sz w:val="24"/>
+                <w:szCs w:val="24"/>
+              </w:rPr>
+            </w:pPr>
+            <w:r>
+              <w:rPr>
+                <w:rFonts w:ascii="Times New Roman" w:hAnsi="Times New Roman"/>
+                <w:sz w:val="24"/>
+                <w:szCs w:val="24"/>
+              </w:rPr>
+              <w:t>:</w:t>
+            </w:r>
+          </w:p>
+        </w:tc>
+        <w:tc>
+          <w:tcPr>
+            <w:tcW w:w="1950" w:type="dxa"/>
+          </w:tcPr>
+          <w:p>
+            <w:pPr>
+              <w:spacing w:after="0"/>
+              <w:rPr>
+                <w:rFonts w:ascii="Times New Roman" w:hAnsi="Times New Roman"/>
+                <w:sz w:val="24"/>
+                <w:szCs w:val="24"/>
+              </w:rPr>
+            </w:pPr>
+            <w:r>
+              <w:rPr>
+                <w:rFonts w:ascii="Times New Roman" w:hAnsi="Times New Roman"/>
+                <w:sz w:val="24"/>
+                <w:szCs w:val="24"/>
+              </w:rPr>
+              <w:t>NIP</w:t>
+            </w:r>
+          </w:p>
+        </w:tc>
+        <w:tc>
+          <w:tcPr>
+            <w:tcW w:w="283" w:type="dxa"/>
+          </w:tcPr>
+          <w:p>
+            <w:pPr>
+              <w:spacing w:after="0"/>
+              <w:rPr>
+                <w:rFonts w:ascii="Times New Roman" w:hAnsi="Times New Roman"/>
+                <w:sz w:val="24"/>
+                <w:szCs w:val="24"/>
+              </w:rPr>
+            </w:pPr>
+            <w:r>
+              <w:rPr>
+                <w:rFonts w:ascii="Times New Roman" w:hAnsi="Times New Roman"/>
+                <w:sz w:val="24"/>
+                <w:szCs w:val="24"/>
+              </w:rPr>
+              <w:t>:</w:t>
+            </w:r>
+          </w:p>
+        </w:tc>
+        <w:tc>
+          <w:tcPr>
+            <w:tcW w:w="5301" w:type="dxa"/>
+          </w:tcPr>
+          <w:p>
+            <w:pPr>
+              <w:spacing w:after="0"/>
+              <w:rPr>
+                <w:rFonts w:ascii="Times New Roman" w:hAnsi="Times New Roman"/>
+                <w:sz w:val="24"/>
+                <w:szCs w:val="24"/>
+              </w:rPr>
+            </w:pPr>
+            <w:r>
+              <w:rPr>
+                <w:rFonts w:ascii="Times New Roman" w:hAnsi="Times New Roman"/>
+                <w:sz w:val="24"/>
+                <w:szCs w:val="24"/>
+              </w:rPr>
+              <w:t>$nip</w:t>
+            </w:r>
+          </w:p>
+        </w:tc>
+      </w:tr>
+      <w:tr>
+        <w:tc>
+          <w:tcPr>
+            <w:tcW w:w="1427" w:type="dxa"/>
+          </w:tcPr>
+          <w:p>
+            <w:pPr>
+              <w:spacing w:after="0"/>
+              <w:rPr>
+                <w:rFonts w:ascii="Times New Roman" w:hAnsi="Times New Roman"/>
+                <w:sz w:val="24"/>
+                <w:szCs w:val="24"/>
+              </w:rPr>
+            </w:pPr>
+          </w:p>
+        </w:tc>
+        <w:tc>
+          <w:tcPr>
+            <w:tcW w:w="283" w:type="dxa"/>
+          </w:tcPr>
+          <w:p>
+            <w:pPr>
+              <w:spacing w:after="0"/>
+              <w:rPr>
+                <w:rFonts w:ascii="Times New Roman" w:hAnsi="Times New Roman"/>
+                <w:sz w:val="24"/>
+                <w:szCs w:val="24"/>
+              </w:rPr>
+            </w:pPr>
+            <w:r>
+              <w:rPr>
+                <w:rFonts w:ascii="Times New Roman" w:hAnsi="Times New Roman"/>
+                <w:sz w:val="24"/>
+                <w:szCs w:val="24"/>
+              </w:rPr>
+              <w:t>:</w:t>
+            </w:r>
+          </w:p>
+        </w:tc>
+        <w:tc>
+          <w:tcPr>
+            <w:tcW w:w="1950" w:type="dxa"/>
+          </w:tcPr>
+          <w:p>
+            <w:pPr>
+              <w:spacing w:after="0"/>
+              <w:rPr>
+                <w:rFonts w:ascii="Times New Roman" w:hAnsi="Times New Roman"/>
+                <w:sz w:val="24"/>
+                <w:szCs w:val="24"/>
+              </w:rPr>
+            </w:pPr>
+            <w:proofErr w:type="spellStart"/>
+            <w:r>
+              <w:rPr>
+                <w:rFonts w:ascii="Times New Roman" w:hAnsi="Times New Roman"/>
+                <w:sz w:val="24"/>
+                <w:szCs w:val="24"/>
+              </w:rPr>
+              <w:t>Pangkat</w:t>
+            </w:r>
+            <w:proofErr w:type="spellEnd"/>
+            <w:r>
+              <w:rPr>
+                <w:rFonts w:ascii="Times New Roman" w:hAnsi="Times New Roman"/>
+                <w:sz w:val="24"/>
+                <w:szCs w:val="24"/>
+              </w:rPr>
+              <w:t>/</w:t>
+            </w:r>
+            <w:proofErr w:type="spellStart"/>
+            <w:r>
+              <w:rPr>
+                <w:rFonts w:ascii="Times New Roman" w:hAnsi="Times New Roman"/>
+                <w:sz w:val="24"/>
+                <w:szCs w:val="24"/>
+              </w:rPr>
+              <w:t>golongan</w:t>
+            </w:r>
+            <w:proofErr w:type="spellEnd"/>
+          </w:p>
+        </w:tc>
+        <w:tc>
+          <w:tcPr>
+            <w:tcW w:w="283" w:type="dxa"/>
+          </w:tcPr>
+          <w:p>
+            <w:pPr>
+              <w:spacing w:after="0"/>
+              <w:rPr>
+                <w:rFonts w:ascii="Times New Roman" w:hAnsi="Times New Roman"/>
+                <w:sz w:val="24"/>
+                <w:szCs w:val="24"/>
+              </w:rPr>
+            </w:pPr>
+            <w:r>
+              <w:rPr>
+                <w:rFonts w:ascii="Times New Roman" w:hAnsi="Times New Roman"/>
+                <w:sz w:val="24"/>
+                <w:szCs w:val="24"/>
+              </w:rPr>
+              <w:t>:</w:t>
+            </w:r>
+          </w:p>
+        </w:tc>
+        <w:tc>
+          <w:tcPr>
+            <w:tcW w:w="5301" w:type="dxa"/>
+          </w:tcPr>
+          <w:p>
+            <w:pPr>
+              <w:spacing w:after="0"/>
+              <w:rPr>
+                <w:rFonts w:ascii="Times New Roman" w:hAnsi="Times New Roman"/>
+                <w:sz w:val="24"/>
+                <w:szCs w:val="24"/>
+              </w:rPr>
+            </w:pPr>
+            <w:r>
+              <w:rPr>
+                <w:rFonts w:ascii="Times New Roman" w:hAnsi="Times New Roman"/>
+                <w:sz w:val="24"/>
+                <w:szCs w:val="24"/>
+              </w:rPr>
+              <w:t>$</w:t>
+            </w:r>
+            <w:proofErr w:type="spellStart"/>
+            <w:r>
+              <w:rPr>
+                <w:rFonts w:ascii="Times New Roman" w:hAnsi="Times New Roman"/>
+                <w:sz w:val="24"/>
+                <w:szCs w:val="24"/>
+              </w:rPr>
+              <w:t>pangkat</w:t>
+            </w:r>
+            <w:proofErr w:type="spellEnd"/>
+          </w:p>
+        </w:tc>
+      </w:tr>
+      <w:tr>
+        <w:tc>
+          <w:tcPr>
+            <w:tcW w:w="1427" w:type="dxa"/>
+          </w:tcPr>
+          <w:p>
+            <w:pPr>
+              <w:spacing w:after="0"/>
+              <w:rPr>
+                <w:rFonts w:ascii="Times New Roman" w:hAnsi="Times New Roman"/>
+                <w:sz w:val="24"/>
+                <w:szCs w:val="24"/>
+              </w:rPr>
+            </w:pPr>
+          </w:p>
+        </w:tc>
+        <w:tc>
+          <w:tcPr>
+            <w:tcW w:w="283" w:type="dxa"/>
+          </w:tcPr>
+          <w:p>
+            <w:pPr>
+              <w:spacing w:after="0"/>
+              <w:rPr>
+                <w:rFonts w:ascii="Times New Roman" w:hAnsi="Times New Roman"/>
+                <w:sz w:val="24"/>
+                <w:szCs w:val="24"/>
+              </w:rPr>
+            </w:pPr>
+            <w:r>
+              <w:rPr>
+                <w:rFonts w:ascii="Times New Roman" w:hAnsi="Times New Roman"/>
+                <w:sz w:val="24"/>
+                <w:szCs w:val="24"/>
+              </w:rPr>
+              <w:t>:</w:t>
+            </w:r>
+          </w:p>
+        </w:tc>
+        <w:tc>
+          <w:tcPr>
+            <w:tcW w:w="1950" w:type="dxa"/>
+          </w:tcPr>
+          <w:p>
+            <w:pPr>
+              <w:spacing w:after="0"/>
+              <w:rPr>
+                <w:rFonts w:ascii="Times New Roman" w:hAnsi="Times New Roman"/>
+                <w:sz w:val="24"/>
+                <w:szCs w:val="24"/>
+              </w:rPr>
+            </w:pPr>
+            <w:proofErr w:type="spellStart"/>
+            <w:r>
+              <w:rPr>
+                <w:rFonts w:ascii="Times New Roman" w:hAnsi="Times New Roman"/>
+                <w:sz w:val="24"/>
+                <w:szCs w:val="24"/>
+              </w:rPr>
+              <w:t>Jabatan</w:t>
+            </w:r>
+            <w:proofErr w:type="spellEnd"/>
+          </w:p>
+        </w:tc>
+        <w:tc>
+          <w:tcPr>
+            <w:tcW w:w="283" w:type="dxa"/>
+          </w:tcPr>
+          <w:p>
+            <w:pPr>
+              <w:spacing w:after="0"/>
+              <w:rPr>
+                <w:rFonts w:ascii="Times New Roman" w:hAnsi="Times New Roman"/>
+                <w:sz w:val="24"/>
+                <w:szCs w:val="24"/>
+              </w:rPr>
+            </w:pPr>
+            <w:r>
+              <w:rPr>
+                <w:rFonts w:ascii="Times New Roman" w:hAnsi="Times New Roman"/>
+                <w:sz w:val="24"/>
+                <w:szCs w:val="24"/>
+              </w:rPr>
+              <w:t>:</w:t>
+            </w:r>
+          </w:p>
+        </w:tc>
+        <w:tc>
+          <w:tcPr>
+            <w:tcW w:w="5301" w:type="dxa"/>
+          </w:tcPr>
+          <w:p>
+            <w:pPr>
+              <w:spacing w:after="0"/>
+              <w:rPr>
+                <w:rFonts w:ascii="Times New Roman" w:hAnsi="Times New Roman"/>
+                <w:sz w:val="24"/>
+                <w:szCs w:val="24"/>
+              </w:rPr>
+            </w:pPr>
+            <w:r>
+              <w:rPr>
+                <w:rFonts w:ascii="Times New Roman" w:hAnsi="Times New Roman"/>
+                <w:sz w:val="24"/>
+                <w:szCs w:val="24"/>
+              </w:rPr>
+              <w:t>$</w:t>
+            </w:r>
+            <w:proofErr w:type="spellStart"/>
+            <w:r>
+              <w:rPr>
+                <w:rFonts w:ascii="Times New Roman" w:hAnsi="Times New Roman"/>
+                <w:sz w:val="24"/>
+                <w:szCs w:val="24"/>
+              </w:rPr>
+              <w:t>pangkatjabat</w:t>
+            </w:r>
+            <w:proofErr w:type="spellEnd"/>
+          </w:p>
+        </w:tc>
+      </w:tr>
+      <w:tr>
+        <w:tc>
+          <w:tcPr>
+            <w:tcW w:w="1427" w:type="dxa"/>
+          </w:tcPr>
+          <w:p>
+            <w:pPr>
+              <w:spacing w:after="0"/>
+              <w:rPr>
+                <w:rFonts w:ascii="Times New Roman" w:hAnsi="Times New Roman"/>
+                <w:sz w:val="24"/>
+                <w:szCs w:val="24"/>
+              </w:rPr>
+            </w:pPr>
+          </w:p>
+        </w:tc>
+        <w:tc>
+          <w:tcPr>
+            <w:tcW w:w="283" w:type="dxa"/>
+          </w:tcPr>
+          <w:p>
+            <w:pPr>
+              <w:spacing w:after="0"/>
+              <w:rPr>
+                <w:rFonts w:ascii="Times New Roman" w:hAnsi="Times New Roman"/>
+                <w:sz w:val="24"/>
+                <w:szCs w:val="24"/>
+              </w:rPr>
+            </w:pPr>
+            <w:r>
+              <w:rPr>
+                <w:rFonts w:ascii="Times New Roman" w:hAnsi="Times New Roman"/>
+                <w:sz w:val="24"/>
+                <w:szCs w:val="24"/>
+              </w:rPr>
+              <w:t>:</w:t>
+            </w:r>
+          </w:p>
+        </w:tc>
+        <w:tc>
+          <w:tcPr>
+            <w:tcW w:w="1950" w:type="dxa"/>
+          </w:tcPr>
+          <w:p>
+            <w:pPr>
+              <w:spacing w:after="0"/>
+              <w:rPr>
+                <w:rFonts w:ascii="Times New Roman" w:hAnsi="Times New Roman"/>
+                <w:sz w:val="24"/>
+                <w:szCs w:val="24"/>
+              </w:rPr>
+            </w:pPr>
+            <w:r>
+              <w:rPr>
+                <w:rFonts w:ascii="Times New Roman" w:hAnsi="Times New Roman"/>
+                <w:sz w:val="24"/>
+                <w:szCs w:val="24"/>
+              </w:rPr>
+              <w:t xml:space="preserve">Unit </w:t>
+            </w:r>
+            <w:proofErr w:type="spellStart"/>
+            <w:r>
+              <w:rPr>
+                <w:rFonts w:ascii="Times New Roman" w:hAnsi="Times New Roman"/>
+                <w:sz w:val="24"/>
+                <w:szCs w:val="24"/>
+              </w:rPr>
+              <w:t>kerja</w:t>
+            </w:r>
+            <w:proofErr w:type="spellEnd"/>
+          </w:p>
+        </w:tc>
+        <w:tc>
+          <w:tcPr>
+            <w:tcW w:w="283" w:type="dxa"/>
+          </w:tcPr>
+          <w:p>
+            <w:pPr>
+              <w:spacing w:after="0"/>
+              <w:rPr>
+                <w:rFonts w:ascii="Times New Roman" w:hAnsi="Times New Roman"/>
+                <w:sz w:val="24"/>
+                <w:szCs w:val="24"/>
+              </w:rPr>
+            </w:pPr>
+            <w:r>
+              <w:rPr>
+                <w:rFonts w:ascii="Times New Roman" w:hAnsi="Times New Roman"/>
+                <w:sz w:val="24"/>
+                <w:szCs w:val="24"/>
+              </w:rPr>
+              <w:t>:</w:t>
+            </w:r>
+          </w:p>
+        </w:tc>
+        <w:tc>
+          <w:tcPr>
+            <w:tcW w:w="5301" w:type="dxa"/>
+          </w:tcPr>
+          <w:p>
+            <w:pPr>
+              <w:spacing w:after="0"/>
+              <w:rPr>
+                <w:rFonts w:ascii="Times New Roman" w:hAnsi="Times New Roman"/>
+                <w:sz w:val="24"/>
+                <w:szCs w:val="24"/>
+              </w:rPr>
+            </w:pPr>
+            <w:r>
+              <w:rPr>
+                <w:rFonts w:ascii="Times New Roman" w:hAnsi="Times New Roman"/>
+                <w:sz w:val="24"/>
+                <w:szCs w:val="24"/>
+              </w:rPr>
+              <w:t xml:space="preserve">SMP Negeri 1 </w:t>
+            </w:r>
+            <w:proofErr w:type="spellStart"/>
+            <w:r>
+              <w:rPr>
+                <w:rFonts w:ascii="Times New Roman" w:hAnsi="Times New Roman"/>
+                <w:sz w:val="24"/>
+                <w:szCs w:val="24"/>
+              </w:rPr>
+              <w:t>Turen</w:t>
+            </w:r>
+            <w:proofErr w:type="spellEnd"/>
+          </w:p>
+        </w:tc>
+      </w:tr>
+      <w:tr>
+        <w:tc>
+          <w:tcPr>
+            <w:tcW w:w="9244" w:type="dxa"/>
+            <w:gridSpan w:val="5"/>
+          </w:tcPr>
+          <w:p>
+            <w:pPr>
+              <w:spacing w:after="0"/>
+              <w:rPr>
+                <w:rFonts w:ascii="Times New Roman" w:hAnsi="Times New Roman"/>
+                <w:sz w:val="24"/>
+                <w:szCs w:val="24"/>
+              </w:rPr>
+            </w:pPr>
+          </w:p>
+        </w:tc>
+      </w:tr>
+      <w:tr>
+        <w:tc>
+          <w:tcPr>
+            <w:tcW w:w="1427" w:type="dxa"/>
+          </w:tcPr>
+          <w:p>
+            <w:pPr>
+              <w:spacing w:after="0"/>
+              <w:rPr>
+                <w:rFonts w:ascii="Times New Roman" w:hAnsi="Times New Roman"/>
+                <w:sz w:val="24"/>
+                <w:szCs w:val="24"/>
+              </w:rPr>
+            </w:pPr>
+            <w:proofErr w:type="spellStart"/>
+            <w:r>
+              <w:rPr>
+                <w:rFonts w:ascii="Times New Roman" w:hAnsi="Times New Roman"/>
+                <w:sz w:val="24"/>
+                <w:szCs w:val="24"/>
+              </w:rPr>
+              <w:t>Untuk</w:t>
+            </w:r>
+            <w:proofErr w:type="spellEnd"/>
+          </w:p>
+        </w:tc>
+        <w:tc>
+          <w:tcPr>
+            <w:tcW w:w="283" w:type="dxa"/>
+          </w:tcPr>
+          <w:p>
+            <w:pPr>
+              <w:spacing w:after="0"/>
+              <w:rPr>
+                <w:rFonts w:ascii="Times New Roman" w:hAnsi="Times New Roman"/>
+                <w:sz w:val="24"/>
+                <w:szCs w:val="24"/>
+              </w:rPr>
+            </w:pPr>
+            <w:r>
+              <w:rPr>
+                <w:rFonts w:ascii="Times New Roman" w:hAnsi="Times New Roman"/>
+                <w:sz w:val="24"/>
+                <w:szCs w:val="24"/>
+              </w:rPr>
+              <w:t>:</w:t>
+            </w:r>
+          </w:p>
+        </w:tc>
+        <w:tc>
+          <w:tcPr>
+            <w:tcW w:w="7534" w:type="dxa"/>
+            <w:gridSpan w:val="3"/>
+          </w:tcPr>
+          <w:p>
+            <w:pPr>
+              <w:spacing w:after="0"/>
+              <w:rPr>
+                <w:rFonts w:ascii="Times New Roman" w:hAnsi="Times New Roman"/>
+                <w:sz w:val="24"/>
+                <w:szCs w:val="24"/>
+              </w:rPr>
+            </w:pPr>
+            <w:proofErr w:type="spellStart"/>
+            <w:r>
+              <w:rPr>
+                <w:rFonts w:ascii="Times New Roman" w:hAnsi="Times New Roman"/>
+                <w:sz w:val="24"/>
+                <w:szCs w:val="24"/>
+              </w:rPr>
+              <w:t>Menghadiri</w:t>
+            </w:r>
+            <w:proofErr w:type="spellEnd"/>
+            <w:r>
+              <w:rPr>
+                <w:rFonts w:ascii="Times New Roman" w:hAnsi="Times New Roman"/>
+                <w:sz w:val="24"/>
+                <w:szCs w:val="24"/>
+              </w:rPr>
+              <w:t xml:space="preserve"> </w:t>
+            </w:r>
+            <w:proofErr w:type="spellStart"/>
+            <w:r>
+              <w:rPr>
+                <w:rFonts w:ascii="Times New Roman" w:hAnsi="Times New Roman"/>
+                <w:sz w:val="24"/>
+                <w:szCs w:val="24"/>
+              </w:rPr>
+              <w:t>undangan</w:t>
+            </w:r>
+            <w:proofErr w:type="spellEnd"/>
+            <w:r>
+              <w:rPr>
+                <w:rFonts w:ascii="Times New Roman" w:hAnsi="Times New Roman"/>
+                <w:sz w:val="24"/>
+                <w:szCs w:val="24"/>
+              </w:rPr>
+              <w:t xml:space="preserve"> </w:t>
+            </w:r>
+            <w:proofErr w:type="spellStart"/>
+            <w:r>
+              <w:rPr>
+                <w:rFonts w:ascii="Times New Roman" w:hAnsi="Times New Roman"/>
+                <w:sz w:val="24"/>
+                <w:szCs w:val="24"/>
+              </w:rPr>
+              <w:t>tersebut</w:t>
+            </w:r>
+            <w:proofErr w:type="spellEnd"/>
+            <w:r>
+              <w:rPr>
+                <w:rFonts w:ascii="Times New Roman" w:hAnsi="Times New Roman"/>
+                <w:sz w:val="24"/>
+                <w:szCs w:val="24"/>
+              </w:rPr>
+              <w:t xml:space="preserve"> yang </w:t>
+            </w:r>
+            <w:proofErr w:type="spellStart"/>
+            <w:r>
+              <w:rPr>
+                <w:rFonts w:ascii="Times New Roman" w:hAnsi="Times New Roman"/>
+                <w:sz w:val="24"/>
+                <w:szCs w:val="24"/>
+              </w:rPr>
+              <w:t>dilaksanakan</w:t>
+            </w:r>
+            <w:proofErr w:type="spellEnd"/>
+            <w:r>
+              <w:rPr>
+                <w:rFonts w:ascii="Times New Roman" w:hAnsi="Times New Roman"/>
+                <w:sz w:val="24"/>
+                <w:szCs w:val="24"/>
+              </w:rPr>
+              <w:t xml:space="preserve"> pada </w:t>
+            </w:r>
+            <w:proofErr w:type="spellStart"/>
+            <w:r>
+              <w:rPr>
+                <w:rFonts w:ascii="Times New Roman" w:hAnsi="Times New Roman"/>
+                <w:sz w:val="24"/>
+                <w:szCs w:val="24"/>
+              </w:rPr>
+              <w:t>hari</w:t>
+            </w:r>
+            <w:proofErr w:type="spellEnd"/>
+            <w:r>
+              <w:rPr>
+                <w:rFonts w:ascii="Times New Roman" w:hAnsi="Times New Roman"/>
+                <w:sz w:val="24"/>
+                <w:szCs w:val="24"/>
+              </w:rPr>
+              <w:t xml:space="preserve"> $</w:t>
+            </w:r>
+            <w:proofErr w:type="spellStart"/>
+            <w:r>
+              <w:rPr>
+                <w:rFonts w:ascii="Times New Roman" w:hAnsi="Times New Roman"/>
+                <w:sz w:val="24"/>
+                <w:szCs w:val="24"/>
+              </w:rPr>
+              <w:t>hari</w:t>
+            </w:r>
+            <w:proofErr w:type="spellEnd"/>
+            <w:r>
+              <w:rPr>
+                <w:rFonts w:ascii="Times New Roman" w:hAnsi="Times New Roman"/>
+                <w:sz w:val="24"/>
+                <w:szCs w:val="24"/>
+              </w:rPr>
+              <w:t xml:space="preserve">  </w:t>
+            </w:r>
+            <w:proofErr w:type="spellStart"/>
+            <w:r>
+              <w:rPr>
+                <w:rFonts w:ascii="Times New Roman" w:hAnsi="Times New Roman"/>
+                <w:sz w:val="24"/>
+                <w:szCs w:val="24"/>
+              </w:rPr>
+              <w:t>pukul</w:t>
+            </w:r>
+            <w:proofErr w:type="spellEnd"/>
+            <w:r>
+              <w:rPr>
+                <w:rFonts w:ascii="Times New Roman" w:hAnsi="Times New Roman"/>
+                <w:sz w:val="24"/>
+                <w:szCs w:val="24"/>
+              </w:rPr>
+              <w:t xml:space="preserve"> $</w:t>
+            </w:r>
+            <w:proofErr w:type="spellStart"/>
+            <w:r>
+              <w:rPr>
+                <w:rFonts w:ascii="Times New Roman" w:hAnsi="Times New Roman"/>
+                <w:sz w:val="24"/>
+                <w:szCs w:val="24"/>
+              </w:rPr>
+              <w:t>mulai</w:t>
+            </w:r>
+            <w:proofErr w:type="spellEnd"/>
+            <w:r>
+              <w:rPr>
+                <w:rFonts w:ascii="Times New Roman" w:hAnsi="Times New Roman"/>
+                <w:sz w:val="24"/>
+                <w:szCs w:val="24"/>
+              </w:rPr>
+              <w:t xml:space="preserve"> WIB </w:t>
+            </w:r>
+            <w:proofErr w:type="spellStart"/>
+            <w:r>
+              <w:rPr>
+                <w:rFonts w:ascii="Times New Roman" w:hAnsi="Times New Roman"/>
+                <w:sz w:val="24"/>
+                <w:szCs w:val="24"/>
+              </w:rPr>
+              <w:t>s.d.</w:t>
+            </w:r>
+            <w:proofErr w:type="spellEnd"/>
+            <w:r>
+              <w:rPr>
+                <w:rFonts w:ascii="Times New Roman" w:hAnsi="Times New Roman"/>
+                <w:sz w:val="24"/>
+                <w:szCs w:val="24"/>
+              </w:rPr>
+              <w:t xml:space="preserve"> ( $</w:t>
+            </w:r>
+            <w:proofErr w:type="spellStart"/>
+            <w:r>
+              <w:rPr>
+                <w:rFonts w:ascii="Times New Roman" w:hAnsi="Times New Roman"/>
+                <w:sz w:val="24"/>
+                <w:szCs w:val="24"/>
+              </w:rPr>
+              <w:t>selesai</w:t>
+            </w:r>
+            <w:proofErr w:type="spellEnd"/>
+            <w:r>
+              <w:rPr>
+                <w:rFonts w:ascii="Times New Roman" w:hAnsi="Times New Roman"/>
+                <w:sz w:val="24"/>
+                <w:szCs w:val="24"/>
+              </w:rPr>
+              <w:t xml:space="preserve"> </w:t>
+            </w:r>
+            <w:proofErr w:type="spellStart"/>
+            <w:r>
+              <w:rPr>
+                <w:rFonts w:ascii="Times New Roman" w:hAnsi="Times New Roman"/>
+                <w:sz w:val="24"/>
+                <w:szCs w:val="24"/>
+              </w:rPr>
+              <w:t>atau</w:t>
+            </w:r>
+            <w:proofErr w:type="spellEnd"/>
+            <w:r>
+              <w:rPr>
+                <w:rFonts w:ascii="Times New Roman" w:hAnsi="Times New Roman"/>
+                <w:sz w:val="24"/>
+                <w:szCs w:val="24"/>
+              </w:rPr>
+              <w:t xml:space="preserve"> / </w:t>
+            </w:r>
+            <w:proofErr w:type="spellStart"/>
+            <w:r>
+              <w:rPr>
+                <w:rFonts w:ascii="Times New Roman" w:hAnsi="Times New Roman"/>
+                <w:sz w:val="24"/>
+                <w:szCs w:val="24"/>
+              </w:rPr>
+              <w:t>selesai</w:t>
+            </w:r>
+            <w:proofErr w:type="spellEnd"/>
+            <w:r>
+              <w:rPr>
+                <w:rFonts w:ascii="Times New Roman" w:hAnsi="Times New Roman"/>
+                <w:sz w:val="24"/>
+                <w:szCs w:val="24"/>
+              </w:rPr>
+              <w:t xml:space="preserve">) </w:t>
+            </w:r>
+            <w:proofErr w:type="spellStart"/>
+            <w:r>
+              <w:rPr>
+                <w:rFonts w:ascii="Times New Roman" w:hAnsi="Times New Roman"/>
+                <w:sz w:val="24"/>
+                <w:szCs w:val="24"/>
+              </w:rPr>
+              <w:t>bertempat</w:t>
+            </w:r>
+            <w:proofErr w:type="spellEnd"/>
+            <w:r>
+              <w:rPr>
+                <w:rFonts w:ascii="Times New Roman" w:hAnsi="Times New Roman"/>
+                <w:sz w:val="24"/>
+                <w:szCs w:val="24"/>
+              </w:rPr>
+              <w:t xml:space="preserve"> di $</w:t>
+            </w:r>
+            <w:proofErr w:type="spellStart"/>
+            <w:r>
+              <w:rPr>
+                <w:rFonts w:ascii="Times New Roman" w:hAnsi="Times New Roman"/>
+                <w:sz w:val="24"/>
+                <w:szCs w:val="24"/>
+              </w:rPr>
+              <w:t>tempat</w:t>
+            </w:r>
+            <w:proofErr w:type="spellEnd"/>
+            <w:r>
+              <w:rPr>
+                <w:rFonts w:ascii="Times New Roman" w:hAnsi="Times New Roman"/>
+                <w:sz w:val="24"/>
+                <w:szCs w:val="24"/>
+              </w:rPr>
+              <w:t xml:space="preserve">,  </w:t>
+            </w:r>
+          </w:p>
+          <w:p>
+            <w:pPr>
+              <w:spacing w:after="0"/>
+              <w:rPr>
+                <w:rFonts w:ascii="Times New Roman" w:hAnsi="Times New Roman"/>
+                <w:sz w:val="24"/>
+                <w:szCs w:val="24"/>
+              </w:rPr>
+            </w:pPr>
+            <w:proofErr w:type="spellStart"/>
+            <w:r>
+              <w:rPr>
+                <w:rFonts w:ascii="Times New Roman" w:hAnsi="Times New Roman"/>
+                <w:sz w:val="24"/>
+                <w:szCs w:val="24"/>
+              </w:rPr>
+              <w:t>dengan</w:t>
+            </w:r>
+            <w:proofErr w:type="spellEnd"/>
+            <w:r>
+              <w:rPr>
+                <w:rFonts w:ascii="Times New Roman" w:hAnsi="Times New Roman"/>
+                <w:sz w:val="24"/>
+                <w:szCs w:val="24"/>
+              </w:rPr>
+              <w:t xml:space="preserve"> </w:t>
+            </w:r>
+            <w:proofErr w:type="spellStart"/>
+            <w:r>
+              <w:rPr>
+                <w:rFonts w:ascii="Times New Roman" w:hAnsi="Times New Roman"/>
+                <w:sz w:val="24"/>
+                <w:szCs w:val="24"/>
+              </w:rPr>
+              <w:t>tema</w:t>
+            </w:r>
+            <w:proofErr w:type="spellEnd"/>
+            <w:r>
+              <w:rPr>
+                <w:rFonts w:ascii="Times New Roman" w:hAnsi="Times New Roman"/>
+                <w:sz w:val="24"/>
+                <w:szCs w:val="24"/>
+              </w:rPr>
+              <w:t xml:space="preserve"> $</w:t>
+            </w:r>
+            <w:proofErr w:type="spellStart"/>
+            <w:r>
+              <w:rPr>
+                <w:rFonts w:ascii="Times New Roman" w:hAnsi="Times New Roman"/>
+                <w:sz w:val="24"/>
+                <w:szCs w:val="24"/>
+              </w:rPr>
+              <w:t>tema</w:t>
+            </w:r>
+            <w:proofErr w:type="spellEnd"/>
+            <w:r>
+              <w:rPr>
+                <w:rFonts w:ascii="Times New Roman" w:hAnsi="Times New Roman"/>
+                <w:sz w:val="24"/>
+                <w:szCs w:val="24"/>
+              </w:rPr>
+              <w:t xml:space="preserve"> . </w:t>
+            </w:r>
+          </w:p>
+          <w:p>
+            <w:pPr>
+              <w:spacing w:after="0"/>
+              <w:rPr>
+                <w:rFonts w:ascii="Times New Roman" w:hAnsi="Times New Roman"/>
+                <w:sz w:val="24"/>
+                <w:szCs w:val="24"/>
+              </w:rPr>
+            </w:pPr>
+          </w:p>
+        </w:tc>
+      </w:tr>
+    </w:tbl>
+    <w:p>
+      <w:pPr>
+        <w:spacing w:before="60" w:after="60" w:line="240" w:lineRule="auto"/>
+        <w:ind w:left="1440" w:firstLine="720"/>
+        <w:rPr>
+          <w:rFonts w:ascii="Times New Roman" w:hAnsi="Times New Roman"/>
           <w:sz w:val="24"/>
           <w:szCs w:val="24"/>
           <w:lang w:val="id-ID"/>
@@ -817,9 +2056,7 @@
     </w:p>
     <w:p>
       <w:pPr>
-        <w:spacing w:after="0" w:line="240" w:lineRule="auto"/>
-        <w:ind w:left="2160" w:hanging="1451"/>
-        <w:jc w:val="both"/>
+        <w:spacing w:before="60" w:after="60"/>
         <w:rPr>
           <w:rFonts w:ascii="Times New Roman" w:hAnsi="Times New Roman"/>
           <w:sz w:val="24"/>
@@ -834,7 +2071,169 @@
           <w:szCs w:val="24"/>
           <w:lang w:val="id-ID"/>
         </w:rPr>
-        <w:t xml:space="preserve">Dasar </w:t>
+        <w:tab/>
+      </w:r>
+      <w:proofErr w:type="spellStart"/>
+      <w:r>
+        <w:rPr>
+          <w:rFonts w:ascii="Times New Roman" w:hAnsi="Times New Roman"/>
+          <w:sz w:val="24"/>
+          <w:szCs w:val="24"/>
+        </w:rPr>
+        <w:t>Sesuai</w:t>
+      </w:r>
+      <w:proofErr w:type="spellEnd"/>
+      <w:r>
+        <w:rPr>
+          <w:rFonts w:ascii="Times New Roman" w:hAnsi="Times New Roman"/>
+          <w:sz w:val="24"/>
+          <w:szCs w:val="24"/>
+        </w:rPr>
+        <w:t xml:space="preserve"> </w:t>
+      </w:r>
+      <w:proofErr w:type="spellStart"/>
+      <w:r>
+        <w:rPr>
+          <w:rFonts w:ascii="Times New Roman" w:hAnsi="Times New Roman"/>
+          <w:sz w:val="24"/>
+          <w:szCs w:val="24"/>
+        </w:rPr>
+        <w:t>prosedur</w:t>
+      </w:r>
+      <w:proofErr w:type="spellEnd"/>
+      <w:r>
+        <w:rPr>
+          <w:rFonts w:ascii="Times New Roman" w:hAnsi="Times New Roman"/>
+          <w:sz w:val="24"/>
+          <w:szCs w:val="24"/>
+        </w:rPr>
+        <w:t xml:space="preserve"> </w:t>
+      </w:r>
+      <w:proofErr w:type="spellStart"/>
+      <w:r>
+        <w:rPr>
+          <w:rFonts w:ascii="Times New Roman" w:hAnsi="Times New Roman"/>
+          <w:sz w:val="24"/>
+          <w:szCs w:val="24"/>
+        </w:rPr>
+        <w:t>setelah</w:t>
+      </w:r>
+      <w:proofErr w:type="spellEnd"/>
+      <w:r>
+        <w:rPr>
+          <w:rFonts w:ascii="Times New Roman" w:hAnsi="Times New Roman"/>
+          <w:sz w:val="24"/>
+          <w:szCs w:val="24"/>
+        </w:rPr>
+        <w:t xml:space="preserve"> </w:t>
+      </w:r>
+      <w:proofErr w:type="spellStart"/>
+      <w:r>
+        <w:rPr>
+          <w:rFonts w:ascii="Times New Roman" w:hAnsi="Times New Roman"/>
+          <w:sz w:val="24"/>
+          <w:szCs w:val="24"/>
+        </w:rPr>
+        <w:t>melaksanakan</w:t>
+      </w:r>
+      <w:proofErr w:type="spellEnd"/>
+      <w:r>
+        <w:rPr>
+          <w:rFonts w:ascii="Times New Roman" w:hAnsi="Times New Roman"/>
+          <w:sz w:val="24"/>
+          <w:szCs w:val="24"/>
+        </w:rPr>
+        <w:t xml:space="preserve"> </w:t>
+      </w:r>
+      <w:proofErr w:type="spellStart"/>
+      <w:r>
+        <w:rPr>
+          <w:rFonts w:ascii="Times New Roman" w:hAnsi="Times New Roman"/>
+          <w:sz w:val="24"/>
+          <w:szCs w:val="24"/>
+        </w:rPr>
+        <w:t>kegiatan</w:t>
+      </w:r>
+      <w:proofErr w:type="spellEnd"/>
+      <w:r>
+        <w:rPr>
+          <w:rFonts w:ascii="Times New Roman" w:hAnsi="Times New Roman"/>
+          <w:sz w:val="24"/>
+          <w:szCs w:val="24"/>
+        </w:rPr>
+        <w:t xml:space="preserve"> </w:t>
+      </w:r>
+      <w:proofErr w:type="spellStart"/>
+      <w:r>
+        <w:rPr>
+          <w:rFonts w:ascii="Times New Roman" w:hAnsi="Times New Roman"/>
+          <w:sz w:val="24"/>
+          <w:szCs w:val="24"/>
+        </w:rPr>
+        <w:t>dimaksud</w:t>
+      </w:r>
+      <w:proofErr w:type="spellEnd"/>
+      <w:r>
+        <w:rPr>
+          <w:rFonts w:ascii="Times New Roman" w:hAnsi="Times New Roman"/>
+          <w:sz w:val="24"/>
+          <w:szCs w:val="24"/>
+        </w:rPr>
+        <w:t xml:space="preserve">, agar </w:t>
+      </w:r>
+      <w:proofErr w:type="spellStart"/>
+      <w:r>
+        <w:rPr>
+          <w:rFonts w:ascii="Times New Roman" w:hAnsi="Times New Roman"/>
+          <w:sz w:val="24"/>
+          <w:szCs w:val="24"/>
+        </w:rPr>
+        <w:t>melaporkan</w:t>
+      </w:r>
+      <w:proofErr w:type="spellEnd"/>
+      <w:r>
+        <w:rPr>
+          <w:rFonts w:ascii="Times New Roman" w:hAnsi="Times New Roman"/>
+          <w:sz w:val="24"/>
+          <w:szCs w:val="24"/>
+        </w:rPr>
+        <w:t xml:space="preserve"> </w:t>
+      </w:r>
+      <w:proofErr w:type="spellStart"/>
+      <w:r>
+        <w:rPr>
+          <w:rFonts w:ascii="Times New Roman" w:hAnsi="Times New Roman"/>
+          <w:sz w:val="24"/>
+          <w:szCs w:val="24"/>
+        </w:rPr>
+        <w:t>hasilnya</w:t>
+      </w:r>
+      <w:proofErr w:type="spellEnd"/>
+      <w:r>
+        <w:rPr>
+          <w:rFonts w:ascii="Times New Roman" w:hAnsi="Times New Roman"/>
+          <w:sz w:val="24"/>
+          <w:szCs w:val="24"/>
+        </w:rPr>
+        <w:t xml:space="preserve"> </w:t>
+      </w:r>
+      <w:proofErr w:type="spellStart"/>
+      <w:r>
+        <w:rPr>
+          <w:rFonts w:ascii="Times New Roman" w:hAnsi="Times New Roman"/>
+          <w:sz w:val="24"/>
+          <w:szCs w:val="24"/>
+        </w:rPr>
+        <w:t>kepada</w:t>
+      </w:r>
+      <w:proofErr w:type="spellEnd"/>
+      <w:r>
+        <w:rPr>
+          <w:rFonts w:ascii="Times New Roman" w:hAnsi="Times New Roman"/>
+          <w:sz w:val="24"/>
+          <w:szCs w:val="24"/>
+        </w:rPr>
+        <w:t xml:space="preserve"> </w:t>
       </w:r>
       <w:r>
         <w:rPr>
@@ -844,846 +2243,24 @@
           <w:lang w:val="id-ID"/>
         </w:rPr>
         <w:tab/>
-        <w:t>:</w:t>
-      </w:r>
-      <w:r>
-        <w:rPr>
-          <w:rFonts w:ascii="Times New Roman" w:hAnsi="Times New Roman"/>
-          <w:sz w:val="24"/>
-          <w:szCs w:val="24"/>
-          <w:lang w:val="id-ID"/>
-        </w:rPr>
-        <w:t xml:space="preserve"> $dasarkalimat</w:t>
-      </w:r>
-    </w:p>
-    <w:p>
-      <w:pPr>
-        <w:spacing w:before="360" w:after="240" w:line="240" w:lineRule="auto"/>
-        <w:ind w:firstLine="720"/>
-        <w:jc w:val="center"/>
-        <w:rPr>
-          <w:rFonts w:ascii="Times New Roman" w:hAnsi="Times New Roman"/>
-          <w:b/>
-          <w:sz w:val="24"/>
-          <w:szCs w:val="24"/>
-          <w:lang w:val="id-ID"/>
-        </w:rPr>
-      </w:pPr>
-      <w:r>
-        <w:rPr>
-          <w:rFonts w:ascii="Times New Roman" w:hAnsi="Times New Roman"/>
-          <w:b/>
-          <w:sz w:val="24"/>
-          <w:szCs w:val="24"/>
-          <w:lang w:val="id-ID"/>
-        </w:rPr>
-        <w:t>ME</w:t>
-      </w:r>
-      <w:r>
-        <w:rPr>
-          <w:rFonts w:ascii="Times New Roman" w:hAnsi="Times New Roman"/>
-          <w:b/>
-          <w:sz w:val="24"/>
-          <w:szCs w:val="24"/>
-          <w:lang w:val="id-ID"/>
-        </w:rPr>
-        <w:t>MERINTAHKAN</w:t>
-      </w:r>
-      <w:r>
-        <w:rPr>
-          <w:rFonts w:ascii="Times New Roman" w:hAnsi="Times New Roman"/>
-          <w:b/>
-          <w:sz w:val="24"/>
-          <w:szCs w:val="24"/>
-          <w:lang w:val="id-ID"/>
-        </w:rPr>
-        <w:t>:</w:t>
-      </w:r>
-    </w:p>
-    <w:p>
-      <w:pPr>
-        <w:spacing w:before="60" w:after="60" w:line="240" w:lineRule="auto"/>
-        <w:rPr>
-          <w:rFonts w:ascii="Times New Roman" w:hAnsi="Times New Roman"/>
-          <w:sz w:val="24"/>
-          <w:szCs w:val="24"/>
-        </w:rPr>
-      </w:pPr>
-      <w:r>
-        <w:rPr>
-          <w:rFonts w:ascii="Times New Roman" w:hAnsi="Times New Roman"/>
-          <w:sz w:val="24"/>
-          <w:szCs w:val="24"/>
-          <w:lang w:val="id-ID"/>
-        </w:rPr>
-        <w:tab/>
-      </w:r>
-      <w:r>
-        <w:rPr>
-          <w:rFonts w:ascii="Times New Roman" w:hAnsi="Times New Roman"/>
-          <w:sz w:val="24"/>
-          <w:szCs w:val="24"/>
-          <w:lang w:val="id-ID"/>
-        </w:rPr>
-        <w:t>Kepada</w:t>
-      </w:r>
-      <w:r>
-        <w:rPr>
-          <w:rFonts w:ascii="Times New Roman" w:hAnsi="Times New Roman"/>
-          <w:sz w:val="24"/>
-          <w:szCs w:val="24"/>
-          <w:lang w:val="id-ID"/>
-        </w:rPr>
-        <w:tab/>
-      </w:r>
-      <w:r>
-        <w:rPr>
-          <w:rFonts w:ascii="Times New Roman" w:hAnsi="Times New Roman"/>
-          <w:sz w:val="24"/>
-          <w:szCs w:val="24"/>
-          <w:lang w:val="id-ID"/>
-        </w:rPr>
-        <w:t>:</w:t>
-      </w:r>
-      <w:r>
-        <w:rPr>
-          <w:rFonts w:ascii="Times New Roman" w:hAnsi="Times New Roman"/>
-          <w:sz w:val="24"/>
-          <w:szCs w:val="24"/>
-          <w:lang w:val="id-ID"/>
-        </w:rPr>
-        <w:t xml:space="preserve">  </w:t>
-      </w:r>
-      <w:r>
-        <w:rPr>
-          <w:rFonts w:ascii="Times New Roman" w:hAnsi="Times New Roman"/>
-          <w:sz w:val="24"/>
-          <w:szCs w:val="24"/>
-          <w:lang w:val="sv-SE"/>
-        </w:rPr>
-        <w:t>nama</w:t>
-      </w:r>
-      <w:r>
-        <w:rPr>
-          <w:rFonts w:ascii="Times New Roman" w:hAnsi="Times New Roman"/>
-          <w:sz w:val="24"/>
-          <w:szCs w:val="24"/>
-          <w:lang w:val="sv-SE"/>
-        </w:rPr>
-        <w:tab/>
-      </w:r>
-      <w:r>
-        <w:rPr>
-          <w:rFonts w:ascii="Times New Roman" w:hAnsi="Times New Roman"/>
-          <w:sz w:val="24"/>
-          <w:szCs w:val="24"/>
-          <w:lang w:val="sv-SE"/>
-        </w:rPr>
-        <w:tab/>
-      </w:r>
-      <w:r>
-        <w:rPr>
-          <w:rFonts w:ascii="Times New Roman" w:hAnsi="Times New Roman"/>
-          <w:sz w:val="24"/>
-          <w:szCs w:val="24"/>
-          <w:lang w:val="sv-SE"/>
-        </w:rPr>
-        <w:tab/>
-        <w:t xml:space="preserve">:  </w:t>
-      </w:r>
-      <w:r>
-        <w:rPr>
-          <w:rFonts w:ascii="Times New Roman" w:hAnsi="Times New Roman"/>
-          <w:sz w:val="24"/>
-          <w:szCs w:val="24"/>
-        </w:rPr>
-        <w:t>$namaguru</w:t>
-      </w:r>
-    </w:p>
-    <w:p>
-      <w:pPr>
-        <w:spacing w:before="60" w:after="60" w:line="240" w:lineRule="auto"/>
-        <w:rPr>
-          <w:rFonts w:ascii="Times New Roman" w:hAnsi="Times New Roman"/>
-          <w:sz w:val="24"/>
-          <w:szCs w:val="24"/>
-        </w:rPr>
-      </w:pPr>
-      <w:r>
-        <w:rPr>
-          <w:rFonts w:ascii="Times New Roman" w:hAnsi="Times New Roman"/>
-          <w:sz w:val="24"/>
-          <w:szCs w:val="24"/>
-          <w:lang w:val="sv-SE"/>
-        </w:rPr>
-        <w:tab/>
-      </w:r>
-      <w:r>
-        <w:rPr>
-          <w:rFonts w:ascii="Times New Roman" w:hAnsi="Times New Roman"/>
-          <w:sz w:val="24"/>
-          <w:szCs w:val="24"/>
-          <w:lang w:val="sv-SE"/>
-        </w:rPr>
-        <w:tab/>
-      </w:r>
-      <w:r>
-        <w:rPr>
-          <w:rFonts w:ascii="Times New Roman" w:hAnsi="Times New Roman"/>
-          <w:sz w:val="24"/>
-          <w:szCs w:val="24"/>
-          <w:lang w:val="id-ID"/>
-        </w:rPr>
-        <w:tab/>
-      </w:r>
-      <w:r>
-        <w:rPr>
-          <w:rFonts w:ascii="Times New Roman" w:hAnsi="Times New Roman"/>
-          <w:sz w:val="24"/>
-          <w:szCs w:val="24"/>
-          <w:lang w:val="id-ID"/>
-        </w:rPr>
-        <w:t xml:space="preserve">   </w:t>
-      </w:r>
-      <w:r>
-        <w:rPr>
-          <w:rFonts w:ascii="Times New Roman" w:hAnsi="Times New Roman"/>
-          <w:sz w:val="24"/>
-          <w:szCs w:val="24"/>
-          <w:lang w:val="sv-SE"/>
-        </w:rPr>
-        <w:t>NIP</w:t>
-      </w:r>
-      <w:r>
-        <w:rPr>
-          <w:rFonts w:ascii="Times New Roman" w:hAnsi="Times New Roman"/>
-          <w:sz w:val="24"/>
-          <w:szCs w:val="24"/>
-          <w:lang w:val="sv-SE"/>
-        </w:rPr>
-        <w:tab/>
-      </w:r>
-      <w:r>
-        <w:rPr>
-          <w:rFonts w:ascii="Times New Roman" w:hAnsi="Times New Roman"/>
-          <w:sz w:val="24"/>
-          <w:szCs w:val="24"/>
-          <w:lang w:val="sv-SE"/>
-        </w:rPr>
-        <w:tab/>
-      </w:r>
-      <w:r>
-        <w:rPr>
-          <w:rFonts w:ascii="Times New Roman" w:hAnsi="Times New Roman"/>
-          <w:sz w:val="24"/>
-          <w:szCs w:val="24"/>
-          <w:lang w:val="sv-SE"/>
-        </w:rPr>
-        <w:tab/>
-        <w:t xml:space="preserve">:  </w:t>
-      </w:r>
-      <w:r>
-        <w:rPr>
-          <w:rFonts w:ascii="Times New Roman" w:hAnsi="Times New Roman"/>
-          <w:sz w:val="24"/>
-          <w:szCs w:val="24"/>
-        </w:rPr>
-        <w:t>$nip</w:t>
-      </w:r>
-    </w:p>
-    <w:p>
-      <w:pPr>
-        <w:spacing w:before="60" w:after="60" w:line="240" w:lineRule="auto"/>
-        <w:rPr>
-          <w:rFonts w:ascii="Times New Roman" w:hAnsi="Times New Roman"/>
-          <w:sz w:val="24"/>
-          <w:szCs w:val="24"/>
-          <w:lang w:val="sv-SE"/>
-        </w:rPr>
-      </w:pPr>
-      <w:r>
-        <w:rPr>
-          <w:rFonts w:ascii="Times New Roman" w:hAnsi="Times New Roman"/>
-          <w:sz w:val="24"/>
-          <w:szCs w:val="24"/>
-          <w:lang w:val="sv-SE"/>
-        </w:rPr>
-        <w:tab/>
-      </w:r>
-      <w:r>
-        <w:rPr>
-          <w:rFonts w:ascii="Times New Roman" w:hAnsi="Times New Roman"/>
-          <w:sz w:val="24"/>
-          <w:szCs w:val="24"/>
-          <w:lang w:val="sv-SE"/>
-        </w:rPr>
-        <w:tab/>
-      </w:r>
-      <w:r>
-        <w:rPr>
-          <w:rFonts w:ascii="Times New Roman" w:hAnsi="Times New Roman"/>
-          <w:sz w:val="24"/>
-          <w:szCs w:val="24"/>
-          <w:lang w:val="id-ID"/>
-        </w:rPr>
-        <w:tab/>
-      </w:r>
-      <w:r>
-        <w:rPr>
-          <w:rFonts w:ascii="Times New Roman" w:hAnsi="Times New Roman"/>
-          <w:sz w:val="24"/>
-          <w:szCs w:val="24"/>
-          <w:lang w:val="id-ID"/>
-        </w:rPr>
-        <w:t xml:space="preserve">   </w:t>
-      </w:r>
-      <w:r>
-        <w:rPr>
-          <w:rFonts w:ascii="Times New Roman" w:hAnsi="Times New Roman"/>
-          <w:sz w:val="24"/>
-          <w:szCs w:val="24"/>
-          <w:lang w:val="sv-SE"/>
-        </w:rPr>
-        <w:t>pangkat/golongan</w:t>
-      </w:r>
-      <w:r>
-        <w:rPr>
-          <w:rFonts w:ascii="Times New Roman" w:hAnsi="Times New Roman"/>
-          <w:sz w:val="24"/>
-          <w:szCs w:val="24"/>
-          <w:lang w:val="sv-SE"/>
-        </w:rPr>
-        <w:tab/>
-        <w:t xml:space="preserve">:  </w:t>
-      </w:r>
-      <w:r>
-        <w:rPr>
-          <w:rFonts w:ascii="Times New Roman" w:hAnsi="Times New Roman"/>
-          <w:sz w:val="24"/>
-          <w:szCs w:val="24"/>
-          <w:lang w:val="sv-SE"/>
-        </w:rPr>
-        <w:t xml:space="preserve">$pangkat </w:t>
-      </w:r>
-    </w:p>
-    <w:p>
-      <w:pPr>
-        <w:spacing w:before="60" w:after="60" w:line="240" w:lineRule="auto"/>
-        <w:rPr>
-          <w:rFonts w:ascii="Times New Roman" w:hAnsi="Times New Roman"/>
-          <w:sz w:val="24"/>
-          <w:szCs w:val="24"/>
-        </w:rPr>
-      </w:pPr>
-      <w:r>
-        <w:rPr>
-          <w:rFonts w:ascii="Times New Roman" w:hAnsi="Times New Roman"/>
-          <w:sz w:val="24"/>
-          <w:szCs w:val="24"/>
-          <w:lang w:val="id-ID"/>
-        </w:rPr>
-        <w:tab/>
-      </w:r>
-      <w:r>
-        <w:rPr>
-          <w:rFonts w:ascii="Times New Roman" w:hAnsi="Times New Roman"/>
-          <w:sz w:val="24"/>
-          <w:szCs w:val="24"/>
-        </w:rPr>
-        <w:tab/>
-      </w:r>
-      <w:r>
-        <w:rPr>
-          <w:rFonts w:ascii="Times New Roman" w:hAnsi="Times New Roman"/>
-          <w:sz w:val="24"/>
-          <w:szCs w:val="24"/>
-          <w:lang w:val="id-ID"/>
-        </w:rPr>
-        <w:tab/>
-      </w:r>
-      <w:r>
-        <w:rPr>
-          <w:rFonts w:ascii="Times New Roman" w:hAnsi="Times New Roman"/>
-          <w:sz w:val="24"/>
-          <w:szCs w:val="24"/>
-          <w:lang w:val="id-ID"/>
-        </w:rPr>
-        <w:t xml:space="preserve">   </w:t>
-      </w:r>
-      <w:r>
-        <w:rPr>
-          <w:rFonts w:ascii="Times New Roman" w:hAnsi="Times New Roman"/>
-          <w:sz w:val="24"/>
-          <w:szCs w:val="24"/>
-          <w:lang w:val="sv-SE"/>
-        </w:rPr>
-        <w:t>jabatan</w:t>
-      </w:r>
-      <w:r>
-        <w:rPr>
-          <w:rFonts w:ascii="Times New Roman" w:hAnsi="Times New Roman"/>
-          <w:sz w:val="24"/>
-          <w:szCs w:val="24"/>
-          <w:lang w:val="sv-SE"/>
-        </w:rPr>
-        <w:tab/>
-      </w:r>
-      <w:r>
-        <w:rPr>
-          <w:rFonts w:ascii="Times New Roman" w:hAnsi="Times New Roman"/>
-          <w:sz w:val="24"/>
-          <w:szCs w:val="24"/>
-          <w:lang w:val="sv-SE"/>
-        </w:rPr>
-        <w:tab/>
-        <w:t xml:space="preserve">:  </w:t>
-      </w:r>
-      <w:r>
-        <w:rPr>
-          <w:rFonts w:ascii="Times New Roman" w:hAnsi="Times New Roman"/>
-          <w:sz w:val="24"/>
-          <w:szCs w:val="24"/>
-          <w:lang w:val="sv-SE"/>
-        </w:rPr>
-        <w:t>$pangkatjabat</w:t>
-      </w:r>
-    </w:p>
-    <w:p>
-      <w:pPr>
-        <w:spacing w:before="60" w:after="60" w:line="240" w:lineRule="auto"/>
-        <w:rPr>
-          <w:rFonts w:ascii="Times New Roman" w:hAnsi="Times New Roman"/>
-          <w:sz w:val="24"/>
-          <w:szCs w:val="24"/>
-          <w:lang w:val="sv-SE"/>
-        </w:rPr>
-      </w:pPr>
-      <w:r>
-        <w:rPr>
-          <w:rFonts w:ascii="Times New Roman" w:hAnsi="Times New Roman"/>
-          <w:sz w:val="24"/>
-          <w:szCs w:val="24"/>
-          <w:lang w:val="sv-SE"/>
-        </w:rPr>
-        <w:tab/>
-      </w:r>
-      <w:r>
-        <w:rPr>
-          <w:rFonts w:ascii="Times New Roman" w:hAnsi="Times New Roman"/>
-          <w:sz w:val="24"/>
-          <w:szCs w:val="24"/>
-          <w:lang w:val="sv-SE"/>
-        </w:rPr>
-        <w:tab/>
-      </w:r>
-      <w:r>
-        <w:rPr>
-          <w:rFonts w:ascii="Times New Roman" w:hAnsi="Times New Roman"/>
-          <w:sz w:val="24"/>
-          <w:szCs w:val="24"/>
-          <w:lang w:val="id-ID"/>
-        </w:rPr>
-        <w:tab/>
-      </w:r>
-      <w:r>
-        <w:rPr>
-          <w:rFonts w:ascii="Times New Roman" w:hAnsi="Times New Roman"/>
-          <w:sz w:val="24"/>
-          <w:szCs w:val="24"/>
-          <w:lang w:val="id-ID"/>
-        </w:rPr>
-        <w:t xml:space="preserve">   </w:t>
-      </w:r>
-      <w:r>
-        <w:rPr>
-          <w:rFonts w:ascii="Times New Roman" w:hAnsi="Times New Roman"/>
-          <w:sz w:val="24"/>
-          <w:szCs w:val="24"/>
-          <w:lang w:val="sv-SE"/>
-        </w:rPr>
-        <w:t>unit kerja</w:t>
-      </w:r>
-      <w:r>
-        <w:rPr>
-          <w:rFonts w:ascii="Times New Roman" w:hAnsi="Times New Roman"/>
-          <w:sz w:val="24"/>
-          <w:szCs w:val="24"/>
-          <w:lang w:val="sv-SE"/>
-        </w:rPr>
-        <w:tab/>
-      </w:r>
-      <w:r>
-        <w:rPr>
-          <w:rFonts w:ascii="Times New Roman" w:hAnsi="Times New Roman"/>
-          <w:sz w:val="24"/>
-          <w:szCs w:val="24"/>
-          <w:lang w:val="sv-SE"/>
-        </w:rPr>
-        <w:tab/>
-        <w:t>:  SMP Negeri 1 Turen</w:t>
-      </w:r>
-    </w:p>
-    <w:p>
-      <w:pPr>
-        <w:spacing w:before="60" w:after="60" w:line="240" w:lineRule="auto"/>
-        <w:rPr>
-          <w:rFonts w:ascii="Times New Roman" w:hAnsi="Times New Roman"/>
-          <w:sz w:val="24"/>
-          <w:szCs w:val="24"/>
-          <w:lang w:val="id-ID"/>
-        </w:rPr>
-      </w:pPr>
-      <w:r>
-        <w:rPr>
-          <w:rFonts w:ascii="Times New Roman" w:hAnsi="Times New Roman"/>
-          <w:sz w:val="24"/>
-          <w:szCs w:val="24"/>
-          <w:lang w:val="sv-SE"/>
-        </w:rPr>
-        <w:tab/>
-      </w:r>
-      <w:r>
-        <w:rPr>
-          <w:rFonts w:ascii="Times New Roman" w:hAnsi="Times New Roman"/>
-          <w:sz w:val="24"/>
-          <w:szCs w:val="24"/>
-          <w:lang w:val="sv-SE"/>
-        </w:rPr>
-        <w:tab/>
-      </w:r>
-      <w:r>
-        <w:rPr>
-          <w:rFonts w:ascii="Times New Roman" w:hAnsi="Times New Roman"/>
-          <w:sz w:val="24"/>
-          <w:szCs w:val="24"/>
-          <w:lang w:val="id-ID"/>
-        </w:rPr>
-        <w:t xml:space="preserve"> </w:t>
-      </w:r>
-      <w:r>
-        <w:rPr>
-          <w:rFonts w:ascii="Times New Roman" w:hAnsi="Times New Roman"/>
-          <w:sz w:val="24"/>
-          <w:szCs w:val="24"/>
-          <w:lang w:val="id-ID"/>
-        </w:rPr>
-        <w:tab/>
-      </w:r>
-    </w:p>
-    <w:p>
-      <w:pPr>
-        <w:spacing w:before="60" w:after="60" w:line="240" w:lineRule="auto"/>
-        <w:rPr>
-          <w:rFonts w:ascii="Times New Roman" w:hAnsi="Times New Roman"/>
-          <w:sz w:val="24"/>
-          <w:szCs w:val="24"/>
-          <w:lang w:val="id-ID"/>
-        </w:rPr>
-      </w:pPr>
-      <w:r>
-        <w:rPr>
-          <w:rFonts w:ascii="Times New Roman" w:hAnsi="Times New Roman"/>
-          <w:sz w:val="24"/>
-          <w:szCs w:val="24"/>
-          <w:lang w:val="id-ID"/>
-        </w:rPr>
-        <w:tab/>
-      </w:r>
-      <w:r>
-        <w:rPr>
-          <w:rFonts w:ascii="Times New Roman" w:hAnsi="Times New Roman"/>
-          <w:sz w:val="24"/>
-          <w:szCs w:val="24"/>
-        </w:rPr>
-        <w:t>Untuk</w:t>
-      </w:r>
-      <w:r>
-        <w:rPr>
-          <w:rFonts w:ascii="Times New Roman" w:hAnsi="Times New Roman"/>
-          <w:sz w:val="24"/>
-          <w:szCs w:val="24"/>
-          <w:lang w:val="id-ID"/>
-        </w:rPr>
-        <w:t xml:space="preserve"> </w:t>
-      </w:r>
-      <w:r>
-        <w:rPr>
-          <w:rFonts w:ascii="Times New Roman" w:hAnsi="Times New Roman"/>
-          <w:sz w:val="24"/>
-          <w:szCs w:val="24"/>
-          <w:lang w:val="id-ID"/>
-        </w:rPr>
-        <w:tab/>
-      </w:r>
-      <w:r>
-        <w:rPr>
-          <w:rFonts w:ascii="Times New Roman" w:hAnsi="Times New Roman"/>
-          <w:sz w:val="24"/>
-          <w:szCs w:val="24"/>
-          <w:lang w:val="id-ID"/>
-        </w:rPr>
-        <w:tab/>
-      </w:r>
-      <w:r>
-        <w:rPr>
-          <w:rFonts w:ascii="Times New Roman" w:hAnsi="Times New Roman"/>
-          <w:sz w:val="24"/>
-          <w:szCs w:val="24"/>
-          <w:lang w:val="id-ID"/>
-        </w:rPr>
-        <w:t>:</w:t>
-      </w:r>
-      <w:r>
-        <w:rPr>
-          <w:rFonts w:ascii="Times New Roman" w:hAnsi="Times New Roman"/>
-          <w:sz w:val="24"/>
-          <w:szCs w:val="24"/>
-          <w:lang w:val="id-ID"/>
-        </w:rPr>
-        <w:t xml:space="preserve">  </w:t>
-      </w:r>
-      <w:r>
-        <w:rPr>
-          <w:rFonts w:ascii="Times New Roman" w:hAnsi="Times New Roman"/>
-          <w:sz w:val="24"/>
-          <w:szCs w:val="24"/>
-          <w:lang w:val="id-ID"/>
-        </w:rPr>
-        <w:t xml:space="preserve">Menghadiri undangan tersebut </w:t>
-      </w:r>
-      <w:r>
-        <w:rPr>
-          <w:rFonts w:ascii="Times New Roman" w:hAnsi="Times New Roman"/>
-          <w:sz w:val="24"/>
-          <w:szCs w:val="24"/>
-          <w:lang w:val="id-ID"/>
-        </w:rPr>
-        <w:t xml:space="preserve">yang dilaksanakan pada hari </w:t>
-      </w:r>
-      <w:r>
-        <w:rPr>
-          <w:rFonts w:ascii="Times New Roman" w:hAnsi="Times New Roman"/>
-          <w:sz w:val="24"/>
-          <w:szCs w:val="24"/>
-        </w:rPr>
-        <w:t>$hari</w:t>
-      </w:r>
-      <w:r>
-        <w:rPr>
-          <w:rFonts w:ascii="Times New Roman" w:hAnsi="Times New Roman"/>
-          <w:sz w:val="24"/>
-          <w:szCs w:val="24"/>
-          <w:lang w:val="id-ID"/>
-        </w:rPr>
-        <w:t xml:space="preserve"> </w:t>
-      </w:r>
-      <w:r>
-        <w:rPr>
-          <w:rFonts w:ascii="Times New Roman" w:hAnsi="Times New Roman"/>
-          <w:sz w:val="24"/>
-          <w:szCs w:val="24"/>
-          <w:lang w:val="id-ID"/>
-        </w:rPr>
-        <w:t xml:space="preserve"> </w:t>
-      </w:r>
-      <w:r>
-        <w:rPr>
-          <w:rFonts w:ascii="Times New Roman" w:hAnsi="Times New Roman"/>
-          <w:sz w:val="24"/>
-          <w:szCs w:val="24"/>
-          <w:lang w:val="id-ID"/>
-        </w:rPr>
-        <w:t xml:space="preserve">pukul </w:t>
-      </w:r>
-      <w:r>
-        <w:rPr>
-          <w:rFonts w:ascii="Times New Roman" w:hAnsi="Times New Roman"/>
-          <w:sz w:val="24"/>
-          <w:szCs w:val="24"/>
-        </w:rPr>
-        <w:t xml:space="preserve">$mulai </w:t>
-      </w:r>
-      <w:r>
-        <w:rPr>
-          <w:rFonts w:ascii="Times New Roman" w:hAnsi="Times New Roman"/>
-          <w:sz w:val="24"/>
-          <w:szCs w:val="24"/>
-          <w:lang w:val="id-ID"/>
-        </w:rPr>
-        <w:t xml:space="preserve">WIB s.d. </w:t>
-      </w:r>
-      <w:r>
-        <w:rPr>
-          <w:rFonts w:ascii="Times New Roman" w:hAnsi="Times New Roman"/>
-          <w:sz w:val="24"/>
-          <w:szCs w:val="24"/>
-        </w:rPr>
-        <w:t xml:space="preserve">( $selesai atau / </w:t>
-      </w:r>
-      <w:r>
-        <w:rPr>
-          <w:rFonts w:ascii="Times New Roman" w:hAnsi="Times New Roman"/>
-          <w:sz w:val="24"/>
-          <w:szCs w:val="24"/>
-          <w:lang w:val="id-ID"/>
-        </w:rPr>
-        <w:t>selesai</w:t>
-      </w:r>
-      <w:r>
-        <w:rPr>
-          <w:rFonts w:ascii="Times New Roman" w:hAnsi="Times New Roman"/>
-          <w:sz w:val="24"/>
-          <w:szCs w:val="24"/>
-        </w:rPr>
-        <w:t>)</w:t>
-      </w:r>
-      <w:r>
-        <w:rPr>
-          <w:rFonts w:ascii="Times New Roman" w:hAnsi="Times New Roman"/>
-          <w:sz w:val="24"/>
-          <w:szCs w:val="24"/>
-          <w:lang w:val="id-ID"/>
-        </w:rPr>
-        <w:t xml:space="preserve"> </w:t>
-      </w:r>
-      <w:r>
-        <w:rPr>
-          <w:rFonts w:ascii="Times New Roman" w:hAnsi="Times New Roman"/>
-          <w:sz w:val="24"/>
-          <w:szCs w:val="24"/>
-          <w:lang w:val="id-ID"/>
-        </w:rPr>
-        <w:t xml:space="preserve">bertempat di </w:t>
-      </w:r>
-      <w:r>
-        <w:rPr>
-          <w:rFonts w:ascii="Times New Roman" w:hAnsi="Times New Roman"/>
-          <w:sz w:val="24"/>
-          <w:szCs w:val="24"/>
-        </w:rPr>
-        <w:t>$tempat</w:t>
-      </w:r>
-      <w:r>
-        <w:rPr>
-          <w:rFonts w:ascii="Times New Roman" w:hAnsi="Times New Roman"/>
-          <w:sz w:val="24"/>
-          <w:szCs w:val="24"/>
-          <w:lang w:val="id-ID"/>
-        </w:rPr>
-        <w:t xml:space="preserve">,   </w:t>
-      </w:r>
-    </w:p>
-    <w:p>
-      <w:pPr>
-        <w:spacing w:before="60" w:after="60" w:line="240" w:lineRule="auto"/>
-        <w:ind w:left="2160" w:firstLine="180"/>
-        <w:rPr>
-          <w:rFonts w:ascii="Times New Roman" w:hAnsi="Times New Roman"/>
-          <w:sz w:val="24"/>
-          <w:szCs w:val="24"/>
-          <w:lang w:val="id-ID"/>
-        </w:rPr>
-      </w:pPr>
-      <w:r>
-        <w:rPr>
-          <w:rFonts w:ascii="Times New Roman" w:hAnsi="Times New Roman"/>
-          <w:sz w:val="24"/>
-          <w:szCs w:val="24"/>
-          <w:lang w:val="id-ID"/>
-        </w:rPr>
-        <w:t xml:space="preserve">dengan tema </w:t>
-      </w:r>
-      <w:r>
-        <w:rPr>
-          <w:rFonts w:ascii="Times New Roman" w:hAnsi="Times New Roman"/>
-          <w:sz w:val="24"/>
-          <w:szCs w:val="24"/>
-        </w:rPr>
-        <w:t xml:space="preserve">$tema </w:t>
-      </w:r>
-      <w:r>
-        <w:rPr>
-          <w:rFonts w:ascii="Times New Roman" w:hAnsi="Times New Roman"/>
-          <w:sz w:val="24"/>
-          <w:szCs w:val="24"/>
-          <w:lang w:val="id-ID"/>
+      </w:r>
+      <w:proofErr w:type="spellStart"/>
+      <w:r>
+        <w:rPr>
+          <w:rFonts w:ascii="Times New Roman" w:hAnsi="Times New Roman"/>
+          <w:sz w:val="24"/>
+          <w:szCs w:val="24"/>
+        </w:rPr>
+        <w:t>Pimpinan</w:t>
+      </w:r>
+      <w:proofErr w:type="spellEnd"/>
+      <w:r>
+        <w:rPr>
+          <w:rFonts w:ascii="Times New Roman" w:hAnsi="Times New Roman"/>
+          <w:sz w:val="24"/>
+          <w:szCs w:val="24"/>
         </w:rPr>
         <w:t>.</w:t>
-      </w:r>
-      <w:r>
-        <w:rPr>
-          <w:rFonts w:ascii="Times New Roman" w:hAnsi="Times New Roman"/>
-          <w:sz w:val="24"/>
-          <w:szCs w:val="24"/>
-          <w:lang w:val="id-ID"/>
-        </w:rPr>
-        <w:t xml:space="preserve"> </w:t>
-      </w:r>
-    </w:p>
-    <w:p>
-      <w:pPr>
-        <w:spacing w:before="60" w:after="60" w:line="240" w:lineRule="auto"/>
-        <w:ind w:left="1440" w:firstLine="720"/>
-        <w:rPr>
-          <w:rFonts w:ascii="Times New Roman" w:hAnsi="Times New Roman"/>
-          <w:sz w:val="24"/>
-          <w:szCs w:val="24"/>
-          <w:lang w:val="id-ID"/>
-        </w:rPr>
-      </w:pPr>
-      <w:r>
-        <w:rPr>
-          <w:rFonts w:ascii="Times New Roman" w:hAnsi="Times New Roman"/>
-          <w:sz w:val="24"/>
-          <w:szCs w:val="24"/>
-          <w:lang w:val="id-ID"/>
-        </w:rPr>
-        <w:t xml:space="preserve">  </w:t>
-      </w:r>
-    </w:p>
-    <w:p>
-      <w:pPr>
-        <w:spacing w:before="60" w:after="60" w:line="240" w:lineRule="auto"/>
-        <w:rPr>
-          <w:rFonts w:ascii="Times New Roman" w:hAnsi="Times New Roman"/>
-          <w:sz w:val="24"/>
-          <w:szCs w:val="24"/>
-          <w:lang w:val="id-ID"/>
-        </w:rPr>
-      </w:pPr>
-      <w:r>
-        <w:rPr>
-          <w:rFonts w:ascii="Times New Roman" w:hAnsi="Times New Roman"/>
-          <w:sz w:val="24"/>
-          <w:szCs w:val="24"/>
-          <w:lang w:val="id-ID"/>
-        </w:rPr>
-        <w:tab/>
-      </w:r>
-      <w:r>
-        <w:rPr>
-          <w:rFonts w:ascii="Times New Roman" w:hAnsi="Times New Roman"/>
-          <w:sz w:val="24"/>
-          <w:szCs w:val="24"/>
-        </w:rPr>
-        <w:t xml:space="preserve">Sesuai prosedur setelah melaksanakan kegiatan dimaksud, agar melaporkan hasilnya kepada </w:t>
-      </w:r>
-      <w:r>
-        <w:rPr>
-          <w:rFonts w:ascii="Times New Roman" w:hAnsi="Times New Roman"/>
-          <w:sz w:val="24"/>
-          <w:szCs w:val="24"/>
-          <w:lang w:val="id-ID"/>
-        </w:rPr>
-        <w:tab/>
-      </w:r>
-      <w:r>
-        <w:rPr>
-          <w:rFonts w:ascii="Times New Roman" w:hAnsi="Times New Roman"/>
-          <w:sz w:val="24"/>
-          <w:szCs w:val="24"/>
-        </w:rPr>
-        <w:t>Pimpinan.</w:t>
       </w:r>
     </w:p>
     <w:p>
@@ -1748,58 +2325,37 @@
     <w:p>
       <w:pPr>
         <w:spacing w:before="60" w:after="60" w:line="240" w:lineRule="auto"/>
+        <w:ind w:firstLine="720"/>
+        <w:rPr>
+          <w:rFonts w:ascii="Times New Roman" w:hAnsi="Times New Roman"/>
+          <w:sz w:val="24"/>
+          <w:szCs w:val="24"/>
+          <w:lang w:val="sv-SE"/>
+        </w:rPr>
+      </w:pPr>
+      <w:r>
         <w:rPr>
           <w:rFonts w:ascii="Times New Roman" w:hAnsi="Times New Roman"/>
           <w:sz w:val="24"/>
           <w:szCs w:val="24"/>
           <w:lang w:val="id-ID"/>
         </w:rPr>
-      </w:pPr>
+        <w:tab/>
+      </w:r>
     </w:p>
     <w:p>
       <w:pPr>
-        <w:spacing w:before="60" w:after="60" w:line="240" w:lineRule="auto"/>
-        <w:ind w:firstLine="720"/>
-        <w:rPr>
-          <w:rFonts w:ascii="Times New Roman" w:hAnsi="Times New Roman"/>
-          <w:sz w:val="24"/>
-          <w:szCs w:val="24"/>
-          <w:lang w:val="sv-SE"/>
-        </w:rPr>
-      </w:pPr>
-      <w:r>
+        <w:spacing w:after="0" w:line="240" w:lineRule="auto"/>
         <w:rPr>
           <w:rFonts w:ascii="Times New Roman" w:hAnsi="Times New Roman"/>
           <w:sz w:val="24"/>
           <w:szCs w:val="24"/>
           <w:lang w:val="id-ID"/>
         </w:rPr>
-        <w:tab/>
-      </w:r>
-      <w:r>
-        <w:rPr>
-          <w:rFonts w:ascii="Times New Roman" w:hAnsi="Times New Roman"/>
-          <w:sz w:val="24"/>
-          <w:szCs w:val="24"/>
-          <w:lang w:val="id-ID"/>
-        </w:rPr>
-        <w:tab/>
-        <w:t xml:space="preserve"> </w:t>
-      </w:r>
+      </w:pPr>
     </w:p>
     <w:p>
       <w:pPr>
-        <w:spacing w:after="0" w:line="240" w:lineRule="auto"/>
-        <w:rPr>
-          <w:rFonts w:ascii="Times New Roman" w:hAnsi="Times New Roman"/>
-          <w:sz w:val="24"/>
-          <w:szCs w:val="24"/>
-          <w:lang w:val="id-ID"/>
-        </w:rPr>
-      </w:pPr>
-    </w:p>
-    <w:p>
-      <w:pPr>
         <w:spacing w:before="60" w:after="60" w:line="240" w:lineRule="auto"/>
         <w:ind w:left="5040" w:firstLine="720"/>
         <w:rPr>
@@ -1824,8 +2380,18 @@
           <w:sz w:val="24"/>
           <w:szCs w:val="24"/>
         </w:rPr>
-        <w:t>$tanggalsurat</w:t>
-      </w:r>
+        <w:t>$</w:t>
+      </w:r>
+      <w:proofErr w:type="spellStart"/>
+      <w:r>
+        <w:rPr>
+          <w:rFonts w:ascii="Times New Roman" w:hAnsi="Times New Roman"/>
+          <w:sz w:val="24"/>
+          <w:szCs w:val="24"/>
+        </w:rPr>
+        <w:t>tanggalsurat</w:t>
+      </w:r>
+      <w:proofErr w:type="spellEnd"/>
       <w:r>
         <w:rPr>
           <w:rFonts w:ascii="Times New Roman" w:hAnsi="Times New Roman"/>
@@ -2507,13 +3073,31 @@
                       <w:lang w:val="id-ID"/>
                     </w:rPr>
                   </w:pPr>
+                  <w:proofErr w:type="spellStart"/>
                   <w:r>
                     <w:rPr>
                       <w:rFonts w:ascii="Times New Roman" w:hAnsi="Times New Roman"/>
                       <w:color w:val="000000"/>
                     </w:rPr>
-                    <w:t>Berangkat dari</w:t>
+                    <w:t>Berangkat</w:t>
                   </w:r>
+                  <w:proofErr w:type="spellEnd"/>
+                  <w:r>
+                    <w:rPr>
+                      <w:rFonts w:ascii="Times New Roman" w:hAnsi="Times New Roman"/>
+                      <w:color w:val="000000"/>
+                    </w:rPr>
+                    <w:t xml:space="preserve"> </w:t>
+                  </w:r>
+                  <w:proofErr w:type="spellStart"/>
+                  <w:r>
+                    <w:rPr>
+                      <w:rFonts w:ascii="Times New Roman" w:hAnsi="Times New Roman"/>
+                      <w:color w:val="000000"/>
+                    </w:rPr>
+                    <w:t>dari</w:t>
+                  </w:r>
+                  <w:proofErr w:type="spellEnd"/>
                   <w:r>
                     <w:rPr>
                       <w:rFonts w:ascii="Times New Roman" w:hAnsi="Times New Roman"/>
@@ -2571,7 +3155,39 @@
                       <w:rFonts w:ascii="Times New Roman" w:hAnsi="Times New Roman"/>
                       <w:color w:val="000000"/>
                     </w:rPr>
-                    <w:t>(Tempat Kedudukan)</w:t>
+                    <w:t>(</w:t>
+                  </w:r>
+                  <w:proofErr w:type="spellStart"/>
+                  <w:r>
+                    <w:rPr>
+                      <w:rFonts w:ascii="Times New Roman" w:hAnsi="Times New Roman"/>
+                      <w:color w:val="000000"/>
+                    </w:rPr>
+                    <w:t>Tempat</w:t>
+                  </w:r>
+                  <w:proofErr w:type="spellEnd"/>
+                  <w:r>
+                    <w:rPr>
+                      <w:rFonts w:ascii="Times New Roman" w:hAnsi="Times New Roman"/>
+                      <w:color w:val="000000"/>
+                    </w:rPr>
+                    <w:t xml:space="preserve"> </w:t>
+                  </w:r>
+                  <w:proofErr w:type="spellStart"/>
+                  <w:r>
+                    <w:rPr>
+                      <w:rFonts w:ascii="Times New Roman" w:hAnsi="Times New Roman"/>
+                      <w:color w:val="000000"/>
+                    </w:rPr>
+                    <w:t>Kedudukan</w:t>
+                  </w:r>
+                  <w:proofErr w:type="spellEnd"/>
+                  <w:r>
+                    <w:rPr>
+                      <w:rFonts w:ascii="Times New Roman" w:hAnsi="Times New Roman"/>
+                      <w:color w:val="000000"/>
+                    </w:rPr>
+                    <w:t>)</w:t>
                   </w:r>
                   <w:r>
                     <w:rPr>
@@ -2666,8 +3282,17 @@
                       <w:rFonts w:ascii="Times New Roman" w:hAnsi="Times New Roman"/>
                       <w:color w:val="000000"/>
                     </w:rPr>
-                    <w:t>Pada tanggal</w:t>
+                    <w:t xml:space="preserve">Pada </w:t>
                   </w:r>
+                  <w:proofErr w:type="spellStart"/>
+                  <w:r>
+                    <w:rPr>
+                      <w:rFonts w:ascii="Times New Roman" w:hAnsi="Times New Roman"/>
+                      <w:color w:val="000000"/>
+                    </w:rPr>
+                    <w:t>tanggal</w:t>
+                  </w:r>
+                  <w:proofErr w:type="spellEnd"/>
                   <w:r>
                     <w:rPr>
                       <w:rFonts w:ascii="Times New Roman" w:hAnsi="Times New Roman"/>
@@ -2697,8 +3322,17 @@
                       <w:rFonts w:ascii="Times New Roman" w:hAnsi="Times New Roman"/>
                       <w:color w:val="000000"/>
                     </w:rPr>
-                    <w:t>$tanggal</w:t>
+                    <w:t>$</w:t>
                   </w:r>
+                  <w:proofErr w:type="spellStart"/>
+                  <w:r>
+                    <w:rPr>
+                      <w:rFonts w:ascii="Times New Roman" w:hAnsi="Times New Roman"/>
+                      <w:color w:val="000000"/>
+                    </w:rPr>
+                    <w:t>tanggal</w:t>
+                  </w:r>
+                  <w:proofErr w:type="spellEnd"/>
                 </w:p>
               </w:tc>
             </w:tr>
@@ -2733,6 +3367,7 @@
                       <w:color w:val="000000"/>
                     </w:rPr>
                   </w:pPr>
+                  <w:proofErr w:type="spellStart"/>
                   <w:r>
                     <w:rPr>
                       <w:rFonts w:ascii="Times New Roman" w:hAnsi="Times New Roman"/>
@@ -2740,6 +3375,7 @@
                     </w:rPr>
                     <w:t>Ke</w:t>
                   </w:r>
+                  <w:proofErr w:type="spellEnd"/>
                   <w:r>
                     <w:rPr>
                       <w:rFonts w:ascii="Times New Roman" w:hAnsi="Times New Roman"/>
@@ -2754,8 +3390,18 @@
                       <w:sz w:val="24"/>
                       <w:szCs w:val="24"/>
                     </w:rPr>
-                    <w:t>$tempat</w:t>
+                    <w:t>$</w:t>
                   </w:r>
+                  <w:proofErr w:type="spellStart"/>
+                  <w:r>
+                    <w:rPr>
+                      <w:rFonts w:ascii="Times New Roman" w:hAnsi="Times New Roman"/>
+                      <w:sz w:val="24"/>
+                      <w:szCs w:val="24"/>
+                    </w:rPr>
+                    <w:t>tempat</w:t>
+                  </w:r>
+                  <w:proofErr w:type="spellEnd"/>
                 </w:p>
                 <w:p>
                   <w:pPr>
@@ -2991,12 +3637,21 @@
                       <w:color w:val="000000"/>
                     </w:rPr>
                   </w:pPr>
+                  <w:proofErr w:type="spellStart"/>
                   <w:r>
                     <w:rPr>
                       <w:rFonts w:ascii="Times New Roman" w:hAnsi="Times New Roman"/>
                       <w:color w:val="000000"/>
                     </w:rPr>
-                    <w:t>Tiba di</w:t>
+                    <w:t>Tiba</w:t>
+                  </w:r>
+                  <w:proofErr w:type="spellEnd"/>
+                  <w:r>
+                    <w:rPr>
+                      <w:rFonts w:ascii="Times New Roman" w:hAnsi="Times New Roman"/>
+                      <w:color w:val="000000"/>
+                    </w:rPr>
+                    <w:t xml:space="preserve"> di</w:t>
                   </w:r>
                 </w:p>
               </w:tc>
@@ -3060,8 +3715,17 @@
                       <w:rFonts w:ascii="Times New Roman" w:hAnsi="Times New Roman"/>
                       <w:color w:val="000000"/>
                     </w:rPr>
-                    <w:t>Pada tanggal</w:t>
+                    <w:t xml:space="preserve">Pada </w:t>
                   </w:r>
+                  <w:proofErr w:type="spellStart"/>
+                  <w:r>
+                    <w:rPr>
+                      <w:rFonts w:ascii="Times New Roman" w:hAnsi="Times New Roman"/>
+                      <w:color w:val="000000"/>
+                    </w:rPr>
+                    <w:t>tanggal</w:t>
+                  </w:r>
+                  <w:proofErr w:type="spellEnd"/>
                 </w:p>
               </w:tc>
               <w:tc>
@@ -3246,6 +3910,7 @@
                       <w:color w:val="000000"/>
                     </w:rPr>
                   </w:pPr>
+                  <w:proofErr w:type="spellStart"/>
                   <w:r>
                     <w:rPr>
                       <w:rFonts w:ascii="Times New Roman" w:hAnsi="Times New Roman"/>
@@ -3253,6 +3918,7 @@
                     </w:rPr>
                     <w:t>Berangkatdari</w:t>
                   </w:r>
+                  <w:proofErr w:type="spellEnd"/>
                 </w:p>
               </w:tc>
               <w:tc>
@@ -3295,6 +3961,7 @@
                       <w:color w:val="000000"/>
                     </w:rPr>
                   </w:pPr>
+                  <w:proofErr w:type="spellStart"/>
                   <w:r>
                     <w:rPr>
                       <w:rFonts w:ascii="Times New Roman" w:hAnsi="Times New Roman"/>
@@ -3302,6 +3969,7 @@
                     </w:rPr>
                     <w:t>Ke</w:t>
                   </w:r>
+                  <w:proofErr w:type="spellEnd"/>
                 </w:p>
               </w:tc>
               <w:tc>
@@ -3349,8 +4017,17 @@
                       <w:rFonts w:ascii="Times New Roman" w:hAnsi="Times New Roman"/>
                       <w:color w:val="000000"/>
                     </w:rPr>
-                    <w:t>Pada tanggal</w:t>
+                    <w:t xml:space="preserve">Pada </w:t>
                   </w:r>
+                  <w:proofErr w:type="spellStart"/>
+                  <w:r>
+                    <w:rPr>
+                      <w:rFonts w:ascii="Times New Roman" w:hAnsi="Times New Roman"/>
+                      <w:color w:val="000000"/>
+                    </w:rPr>
+                    <w:t>tanggal</w:t>
+                  </w:r>
+                  <w:proofErr w:type="spellEnd"/>
                 </w:p>
               </w:tc>
               <w:tc>
@@ -3495,12 +4172,21 @@
                       <w:color w:val="000000"/>
                     </w:rPr>
                   </w:pPr>
+                  <w:proofErr w:type="spellStart"/>
                   <w:r>
                     <w:rPr>
                       <w:rFonts w:ascii="Times New Roman" w:hAnsi="Times New Roman"/>
                       <w:color w:val="000000"/>
                     </w:rPr>
-                    <w:t>Tiba di</w:t>
+                    <w:t>Tiba</w:t>
+                  </w:r>
+                  <w:proofErr w:type="spellEnd"/>
+                  <w:r>
+                    <w:rPr>
+                      <w:rFonts w:ascii="Times New Roman" w:hAnsi="Times New Roman"/>
+                      <w:color w:val="000000"/>
+                    </w:rPr>
+                    <w:t xml:space="preserve"> di</w:t>
                   </w:r>
                 </w:p>
               </w:tc>
@@ -3564,8 +4250,17 @@
                       <w:rFonts w:ascii="Times New Roman" w:hAnsi="Times New Roman"/>
                       <w:color w:val="000000"/>
                     </w:rPr>
-                    <w:t>Pada tanggal</w:t>
+                    <w:t xml:space="preserve">Pada </w:t>
                   </w:r>
+                  <w:proofErr w:type="spellStart"/>
+                  <w:r>
+                    <w:rPr>
+                      <w:rFonts w:ascii="Times New Roman" w:hAnsi="Times New Roman"/>
+                      <w:color w:val="000000"/>
+                    </w:rPr>
+                    <w:t>tanggal</w:t>
+                  </w:r>
+                  <w:proofErr w:type="spellEnd"/>
                 </w:p>
               </w:tc>
               <w:tc>
@@ -3750,6 +4445,7 @@
                       <w:color w:val="000000"/>
                     </w:rPr>
                   </w:pPr>
+                  <w:proofErr w:type="spellStart"/>
                   <w:r>
                     <w:rPr>
                       <w:rFonts w:ascii="Times New Roman" w:hAnsi="Times New Roman"/>
@@ -3757,6 +4453,7 @@
                     </w:rPr>
                     <w:t>Berangkatdari</w:t>
                   </w:r>
+                  <w:proofErr w:type="spellEnd"/>
                 </w:p>
               </w:tc>
               <w:tc>
@@ -3799,6 +4496,7 @@
                       <w:color w:val="000000"/>
                     </w:rPr>
                   </w:pPr>
+                  <w:proofErr w:type="spellStart"/>
                   <w:r>
                     <w:rPr>
                       <w:rFonts w:ascii="Times New Roman" w:hAnsi="Times New Roman"/>
@@ -3806,6 +4504,7 @@
                     </w:rPr>
                     <w:t>Ke</w:t>
                   </w:r>
+                  <w:proofErr w:type="spellEnd"/>
                 </w:p>
               </w:tc>
               <w:tc>
@@ -3853,8 +4552,17 @@
                       <w:rFonts w:ascii="Times New Roman" w:hAnsi="Times New Roman"/>
                       <w:color w:val="000000"/>
                     </w:rPr>
-                    <w:t>Pada tanggal</w:t>
+                    <w:t xml:space="preserve">Pada </w:t>
                   </w:r>
+                  <w:proofErr w:type="spellStart"/>
+                  <w:r>
+                    <w:rPr>
+                      <w:rFonts w:ascii="Times New Roman" w:hAnsi="Times New Roman"/>
+                      <w:color w:val="000000"/>
+                    </w:rPr>
+                    <w:t>tanggal</w:t>
+                  </w:r>
+                  <w:proofErr w:type="spellEnd"/>
                 </w:p>
               </w:tc>
               <w:tc>
@@ -4053,12 +4761,21 @@
                       <w:color w:val="000000"/>
                     </w:rPr>
                   </w:pPr>
+                  <w:proofErr w:type="spellStart"/>
                   <w:r>
                     <w:rPr>
                       <w:rFonts w:ascii="Times New Roman" w:hAnsi="Times New Roman"/>
                       <w:color w:val="000000"/>
                     </w:rPr>
-                    <w:t>Tiba di</w:t>
+                    <w:t>Tiba</w:t>
+                  </w:r>
+                  <w:proofErr w:type="spellEnd"/>
+                  <w:r>
+                    <w:rPr>
+                      <w:rFonts w:ascii="Times New Roman" w:hAnsi="Times New Roman"/>
+                      <w:color w:val="000000"/>
+                    </w:rPr>
+                    <w:t xml:space="preserve"> di</w:t>
                   </w:r>
                 </w:p>
               </w:tc>
@@ -4116,8 +4833,17 @@
                       <w:rFonts w:ascii="Times New Roman" w:hAnsi="Times New Roman"/>
                       <w:color w:val="000000"/>
                     </w:rPr>
-                    <w:t>Pada anggal</w:t>
+                    <w:t xml:space="preserve">Pada </w:t>
                   </w:r>
+                  <w:proofErr w:type="spellStart"/>
+                  <w:r>
+                    <w:rPr>
+                      <w:rFonts w:ascii="Times New Roman" w:hAnsi="Times New Roman"/>
+                      <w:color w:val="000000"/>
+                    </w:rPr>
+                    <w:t>anggal</w:t>
+                  </w:r>
+                  <w:proofErr w:type="spellEnd"/>
                 </w:p>
               </w:tc>
               <w:tc>
@@ -4291,6 +5017,7 @@
                       <w:color w:val="000000"/>
                     </w:rPr>
                   </w:pPr>
+                  <w:proofErr w:type="spellStart"/>
                   <w:r>
                     <w:rPr>
                       <w:rFonts w:ascii="Times New Roman" w:hAnsi="Times New Roman"/>
@@ -4298,6 +5025,7 @@
                     </w:rPr>
                     <w:t>Berangkatdari</w:t>
                   </w:r>
+                  <w:proofErr w:type="spellEnd"/>
                 </w:p>
               </w:tc>
               <w:tc>
@@ -4340,6 +5068,7 @@
                       <w:color w:val="000000"/>
                     </w:rPr>
                   </w:pPr>
+                  <w:proofErr w:type="spellStart"/>
                   <w:r>
                     <w:rPr>
                       <w:rFonts w:ascii="Times New Roman" w:hAnsi="Times New Roman"/>
@@ -4347,6 +5076,7 @@
                     </w:rPr>
                     <w:t>Ke</w:t>
                   </w:r>
+                  <w:proofErr w:type="spellEnd"/>
                 </w:p>
               </w:tc>
               <w:tc>
@@ -4394,8 +5124,17 @@
                       <w:rFonts w:ascii="Times New Roman" w:hAnsi="Times New Roman"/>
                       <w:color w:val="000000"/>
                     </w:rPr>
-                    <w:t>Pada tanggal</w:t>
+                    <w:t xml:space="preserve">Pada </w:t>
                   </w:r>
+                  <w:proofErr w:type="spellStart"/>
+                  <w:r>
+                    <w:rPr>
+                      <w:rFonts w:ascii="Times New Roman" w:hAnsi="Times New Roman"/>
+                      <w:color w:val="000000"/>
+                    </w:rPr>
+                    <w:t>tanggal</w:t>
+                  </w:r>
+                  <w:proofErr w:type="spellEnd"/>
                 </w:p>
               </w:tc>
               <w:tc>
@@ -4574,12 +5313,21 @@
                       <w:color w:val="000000"/>
                     </w:rPr>
                   </w:pPr>
+                  <w:proofErr w:type="spellStart"/>
                   <w:r>
                     <w:rPr>
                       <w:rFonts w:ascii="Times New Roman" w:hAnsi="Times New Roman"/>
                       <w:color w:val="000000"/>
                     </w:rPr>
-                    <w:t>Tiba di</w:t>
+                    <w:t>Tiba</w:t>
+                  </w:r>
+                  <w:proofErr w:type="spellEnd"/>
+                  <w:r>
+                    <w:rPr>
+                      <w:rFonts w:ascii="Times New Roman" w:hAnsi="Times New Roman"/>
+                      <w:color w:val="000000"/>
+                    </w:rPr>
+                    <w:t xml:space="preserve"> di</w:t>
                   </w:r>
                 </w:p>
               </w:tc>
@@ -4643,8 +5391,17 @@
                       <w:rFonts w:ascii="Times New Roman" w:hAnsi="Times New Roman"/>
                       <w:color w:val="000000"/>
                     </w:rPr>
-                    <w:t>Pada tanggal</w:t>
+                    <w:t xml:space="preserve">Pada </w:t>
                   </w:r>
+                  <w:proofErr w:type="spellStart"/>
+                  <w:r>
+                    <w:rPr>
+                      <w:rFonts w:ascii="Times New Roman" w:hAnsi="Times New Roman"/>
+                      <w:color w:val="000000"/>
+                    </w:rPr>
+                    <w:t>tanggal</w:t>
+                  </w:r>
+                  <w:proofErr w:type="spellEnd"/>
                 </w:p>
               </w:tc>
               <w:tc>
@@ -4672,8 +5429,17 @@
                       <w:rFonts w:ascii="Times New Roman" w:hAnsi="Times New Roman"/>
                       <w:color w:val="000000"/>
                     </w:rPr>
-                    <w:t>$tanggal</w:t>
+                    <w:t>$</w:t>
                   </w:r>
+                  <w:proofErr w:type="spellStart"/>
+                  <w:r>
+                    <w:rPr>
+                      <w:rFonts w:ascii="Times New Roman" w:hAnsi="Times New Roman"/>
+                      <w:color w:val="000000"/>
+                    </w:rPr>
+                    <w:t>tanggal</w:t>
+                  </w:r>
+                  <w:proofErr w:type="spellEnd"/>
                 </w:p>
               </w:tc>
             </w:tr>
@@ -4863,7 +5629,295 @@
                 <w:rFonts w:ascii="Times New Roman" w:hAnsi="Times New Roman"/>
                 <w:color w:val="000000"/>
               </w:rPr>
-              <w:t>Telah diperiksa dengan keterangan bahwa perjalanan tersebut di atas benar dilakukan atas perintahnya dan semata-mata untuk kepentingan jabatan dalam waktu sesingkat-singkatnya.</w:t>
+              <w:t xml:space="preserve">Telah </w:t>
+            </w:r>
+            <w:proofErr w:type="spellStart"/>
+            <w:r>
+              <w:rPr>
+                <w:rFonts w:ascii="Times New Roman" w:hAnsi="Times New Roman"/>
+                <w:color w:val="000000"/>
+              </w:rPr>
+              <w:t>diperiksa</w:t>
+            </w:r>
+            <w:proofErr w:type="spellEnd"/>
+            <w:r>
+              <w:rPr>
+                <w:rFonts w:ascii="Times New Roman" w:hAnsi="Times New Roman"/>
+                <w:color w:val="000000"/>
+              </w:rPr>
+              <w:t xml:space="preserve"> </w:t>
+            </w:r>
+            <w:proofErr w:type="spellStart"/>
+            <w:r>
+              <w:rPr>
+                <w:rFonts w:ascii="Times New Roman" w:hAnsi="Times New Roman"/>
+                <w:color w:val="000000"/>
+              </w:rPr>
+              <w:t>dengan</w:t>
+            </w:r>
+            <w:proofErr w:type="spellEnd"/>
+            <w:r>
+              <w:rPr>
+                <w:rFonts w:ascii="Times New Roman" w:hAnsi="Times New Roman"/>
+                <w:color w:val="000000"/>
+              </w:rPr>
+              <w:t xml:space="preserve"> </w:t>
+            </w:r>
+            <w:proofErr w:type="spellStart"/>
+            <w:r>
+              <w:rPr>
+                <w:rFonts w:ascii="Times New Roman" w:hAnsi="Times New Roman"/>
+                <w:color w:val="000000"/>
+              </w:rPr>
+              <w:t>keterangan</w:t>
+            </w:r>
+            <w:proofErr w:type="spellEnd"/>
+            <w:r>
+              <w:rPr>
+                <w:rFonts w:ascii="Times New Roman" w:hAnsi="Times New Roman"/>
+                <w:color w:val="000000"/>
+              </w:rPr>
+              <w:t xml:space="preserve"> </w:t>
+            </w:r>
+            <w:proofErr w:type="spellStart"/>
+            <w:r>
+              <w:rPr>
+                <w:rFonts w:ascii="Times New Roman" w:hAnsi="Times New Roman"/>
+                <w:color w:val="000000"/>
+              </w:rPr>
+              <w:t>bahwa</w:t>
+            </w:r>
+            <w:proofErr w:type="spellEnd"/>
+            <w:r>
+              <w:rPr>
+                <w:rFonts w:ascii="Times New Roman" w:hAnsi="Times New Roman"/>
+                <w:color w:val="000000"/>
+              </w:rPr>
+              <w:t xml:space="preserve"> </w:t>
+            </w:r>
+            <w:proofErr w:type="spellStart"/>
+            <w:r>
+              <w:rPr>
+                <w:rFonts w:ascii="Times New Roman" w:hAnsi="Times New Roman"/>
+                <w:color w:val="000000"/>
+              </w:rPr>
+              <w:t>perjalanan</w:t>
+            </w:r>
+            <w:proofErr w:type="spellEnd"/>
+            <w:r>
+              <w:rPr>
+                <w:rFonts w:ascii="Times New Roman" w:hAnsi="Times New Roman"/>
+                <w:color w:val="000000"/>
+              </w:rPr>
+              <w:t xml:space="preserve"> </w:t>
+            </w:r>
+            <w:proofErr w:type="spellStart"/>
+            <w:r>
+              <w:rPr>
+                <w:rFonts w:ascii="Times New Roman" w:hAnsi="Times New Roman"/>
+                <w:color w:val="000000"/>
+              </w:rPr>
+              <w:t>tersebut</w:t>
+            </w:r>
+            <w:proofErr w:type="spellEnd"/>
+            <w:r>
+              <w:rPr>
+                <w:rFonts w:ascii="Times New Roman" w:hAnsi="Times New Roman"/>
+                <w:color w:val="000000"/>
+              </w:rPr>
+              <w:t xml:space="preserve"> di </w:t>
+            </w:r>
+            <w:proofErr w:type="spellStart"/>
+            <w:r>
+              <w:rPr>
+                <w:rFonts w:ascii="Times New Roman" w:hAnsi="Times New Roman"/>
+                <w:color w:val="000000"/>
+              </w:rPr>
+              <w:t>atas</w:t>
+            </w:r>
+            <w:proofErr w:type="spellEnd"/>
+            <w:r>
+              <w:rPr>
+                <w:rFonts w:ascii="Times New Roman" w:hAnsi="Times New Roman"/>
+                <w:color w:val="000000"/>
+              </w:rPr>
+              <w:t xml:space="preserve"> </w:t>
+            </w:r>
+            <w:proofErr w:type="spellStart"/>
+            <w:r>
+              <w:rPr>
+                <w:rFonts w:ascii="Times New Roman" w:hAnsi="Times New Roman"/>
+                <w:color w:val="000000"/>
+              </w:rPr>
+              <w:t>benar</w:t>
+            </w:r>
+            <w:proofErr w:type="spellEnd"/>
+            <w:r>
+              <w:rPr>
+                <w:rFonts w:ascii="Times New Roman" w:hAnsi="Times New Roman"/>
+                <w:color w:val="000000"/>
+              </w:rPr>
+              <w:t xml:space="preserve"> </w:t>
+            </w:r>
+            <w:proofErr w:type="spellStart"/>
+            <w:r>
+              <w:rPr>
+                <w:rFonts w:ascii="Times New Roman" w:hAnsi="Times New Roman"/>
+                <w:color w:val="000000"/>
+              </w:rPr>
+              <w:t>dilakukan</w:t>
+            </w:r>
+            <w:proofErr w:type="spellEnd"/>
+            <w:r>
+              <w:rPr>
+                <w:rFonts w:ascii="Times New Roman" w:hAnsi="Times New Roman"/>
+                <w:color w:val="000000"/>
+              </w:rPr>
+              <w:t xml:space="preserve"> </w:t>
+            </w:r>
+            <w:proofErr w:type="spellStart"/>
+            <w:r>
+              <w:rPr>
+                <w:rFonts w:ascii="Times New Roman" w:hAnsi="Times New Roman"/>
+                <w:color w:val="000000"/>
+              </w:rPr>
+              <w:t>atas</w:t>
+            </w:r>
+            <w:proofErr w:type="spellEnd"/>
+            <w:r>
+              <w:rPr>
+                <w:rFonts w:ascii="Times New Roman" w:hAnsi="Times New Roman"/>
+                <w:color w:val="000000"/>
+              </w:rPr>
+              <w:t xml:space="preserve"> </w:t>
+            </w:r>
+            <w:proofErr w:type="spellStart"/>
+            <w:r>
+              <w:rPr>
+                <w:rFonts w:ascii="Times New Roman" w:hAnsi="Times New Roman"/>
+                <w:color w:val="000000"/>
+              </w:rPr>
+              <w:t>perintahnya</w:t>
+            </w:r>
+            <w:proofErr w:type="spellEnd"/>
+            <w:r>
+              <w:rPr>
+                <w:rFonts w:ascii="Times New Roman" w:hAnsi="Times New Roman"/>
+                <w:color w:val="000000"/>
+              </w:rPr>
+              <w:t xml:space="preserve"> dan </w:t>
+            </w:r>
+            <w:proofErr w:type="spellStart"/>
+            <w:r>
+              <w:rPr>
+                <w:rFonts w:ascii="Times New Roman" w:hAnsi="Times New Roman"/>
+                <w:color w:val="000000"/>
+              </w:rPr>
+              <w:t>semata-mata</w:t>
+            </w:r>
+            <w:proofErr w:type="spellEnd"/>
+            <w:r>
+              <w:rPr>
+                <w:rFonts w:ascii="Times New Roman" w:hAnsi="Times New Roman"/>
+                <w:color w:val="000000"/>
+              </w:rPr>
+              <w:t xml:space="preserve"> </w:t>
+            </w:r>
+            <w:proofErr w:type="spellStart"/>
+            <w:r>
+              <w:rPr>
+                <w:rFonts w:ascii="Times New Roman" w:hAnsi="Times New Roman"/>
+                <w:color w:val="000000"/>
+              </w:rPr>
+              <w:t>untuk</w:t>
+            </w:r>
+            <w:proofErr w:type="spellEnd"/>
+            <w:r>
+              <w:rPr>
+                <w:rFonts w:ascii="Times New Roman" w:hAnsi="Times New Roman"/>
+                <w:color w:val="000000"/>
+              </w:rPr>
+              <w:t xml:space="preserve"> </w:t>
+            </w:r>
+            <w:proofErr w:type="spellStart"/>
+            <w:r>
+              <w:rPr>
+                <w:rFonts w:ascii="Times New Roman" w:hAnsi="Times New Roman"/>
+                <w:color w:val="000000"/>
+              </w:rPr>
+              <w:t>kepentingan</w:t>
+            </w:r>
+            <w:proofErr w:type="spellEnd"/>
+            <w:r>
+              <w:rPr>
+                <w:rFonts w:ascii="Times New Roman" w:hAnsi="Times New Roman"/>
+                <w:color w:val="000000"/>
+              </w:rPr>
+              <w:t xml:space="preserve"> </w:t>
+            </w:r>
+            <w:proofErr w:type="spellStart"/>
+            <w:r>
+              <w:rPr>
+                <w:rFonts w:ascii="Times New Roman" w:hAnsi="Times New Roman"/>
+                <w:color w:val="000000"/>
+              </w:rPr>
+              <w:t>jabatan</w:t>
+            </w:r>
+            <w:proofErr w:type="spellEnd"/>
+            <w:r>
+              <w:rPr>
+                <w:rFonts w:ascii="Times New Roman" w:hAnsi="Times New Roman"/>
+                <w:color w:val="000000"/>
+              </w:rPr>
+              <w:t xml:space="preserve"> </w:t>
+            </w:r>
+            <w:proofErr w:type="spellStart"/>
+            <w:r>
+              <w:rPr>
+                <w:rFonts w:ascii="Times New Roman" w:hAnsi="Times New Roman"/>
+                <w:color w:val="000000"/>
+              </w:rPr>
+              <w:t>dalam</w:t>
+            </w:r>
+            <w:proofErr w:type="spellEnd"/>
+            <w:r>
+              <w:rPr>
+                <w:rFonts w:ascii="Times New Roman" w:hAnsi="Times New Roman"/>
+                <w:color w:val="000000"/>
+              </w:rPr>
+              <w:t xml:space="preserve"> </w:t>
+            </w:r>
+            <w:proofErr w:type="spellStart"/>
+            <w:r>
+              <w:rPr>
+                <w:rFonts w:ascii="Times New Roman" w:hAnsi="Times New Roman"/>
+                <w:color w:val="000000"/>
+              </w:rPr>
+              <w:t>waktu</w:t>
+            </w:r>
+            <w:proofErr w:type="spellEnd"/>
+            <w:r>
+              <w:rPr>
+                <w:rFonts w:ascii="Times New Roman" w:hAnsi="Times New Roman"/>
+                <w:color w:val="000000"/>
+              </w:rPr>
+              <w:t xml:space="preserve"> </w:t>
+            </w:r>
+            <w:proofErr w:type="spellStart"/>
+            <w:r>
+              <w:rPr>
+                <w:rFonts w:ascii="Times New Roman" w:hAnsi="Times New Roman"/>
+                <w:color w:val="000000"/>
+              </w:rPr>
+              <w:t>sesingkat-singkatnya</w:t>
+            </w:r>
+            <w:proofErr w:type="spellEnd"/>
+            <w:r>
+              <w:rPr>
+                <w:rFonts w:ascii="Times New Roman" w:hAnsi="Times New Roman"/>
+                <w:color w:val="000000"/>
+              </w:rPr>
+              <w:t>.</w:t>
             </w:r>
           </w:p>
           <w:p>
@@ -5718,7 +6772,23 @@
                 <w:rFonts w:ascii="Times New Roman" w:hAnsi="Times New Roman"/>
                 <w:color w:val="000000"/>
               </w:rPr>
-              <w:t xml:space="preserve">Jalan Panglima Sudirman </w:t>
+              <w:t xml:space="preserve">Jalan </w:t>
+            </w:r>
+            <w:proofErr w:type="spellStart"/>
+            <w:r>
+              <w:rPr>
+                <w:rFonts w:ascii="Times New Roman" w:hAnsi="Times New Roman"/>
+                <w:color w:val="000000"/>
+              </w:rPr>
+              <w:t>Panglima</w:t>
+            </w:r>
+            <w:proofErr w:type="spellEnd"/>
+            <w:r>
+              <w:rPr>
+                <w:rFonts w:ascii="Times New Roman" w:hAnsi="Times New Roman"/>
+                <w:color w:val="000000"/>
+              </w:rPr>
+              <w:t xml:space="preserve"> Sudirman </w:t>
             </w:r>
             <w:r>
               <w:rPr>
@@ -5758,7 +6828,23 @@
                 <w:rFonts w:ascii="Times New Roman" w:hAnsi="Times New Roman"/>
                 <w:color w:val="000000"/>
               </w:rPr>
-              <w:t xml:space="preserve"> Telepon </w:t>
+              <w:t xml:space="preserve"> </w:t>
+            </w:r>
+            <w:proofErr w:type="spellStart"/>
+            <w:r>
+              <w:rPr>
+                <w:rFonts w:ascii="Times New Roman" w:hAnsi="Times New Roman"/>
+                <w:color w:val="000000"/>
+              </w:rPr>
+              <w:t>Telepon</w:t>
+            </w:r>
+            <w:proofErr w:type="spellEnd"/>
+            <w:r>
+              <w:rPr>
+                <w:rFonts w:ascii="Times New Roman" w:hAnsi="Times New Roman"/>
+                <w:color w:val="000000"/>
+              </w:rPr>
+              <w:t xml:space="preserve"> </w:t>
             </w:r>
             <w:r>
               <w:rPr>
@@ -6428,8 +7514,17 @@
                 <w:rFonts w:ascii="Times New Roman" w:hAnsi="Times New Roman"/>
                 <w:color w:val="000000"/>
               </w:rPr>
-              <w:t>$nama</w:t>
-            </w:r>
+              <w:t>$</w:t>
+            </w:r>
+            <w:proofErr w:type="spellStart"/>
+            <w:r>
+              <w:rPr>
+                <w:rFonts w:ascii="Times New Roman" w:hAnsi="Times New Roman"/>
+                <w:color w:val="000000"/>
+              </w:rPr>
+              <w:t>nama</w:t>
+            </w:r>
+            <w:proofErr w:type="spellEnd"/>
           </w:p>
         </w:tc>
       </w:tr>
@@ -6603,8 +7698,17 @@
                 <w:rFonts w:ascii="Times New Roman" w:hAnsi="Times New Roman"/>
                 <w:color w:val="000000"/>
               </w:rPr>
-              <w:t>$pangkat</w:t>
-            </w:r>
+              <w:t>$</w:t>
+            </w:r>
+            <w:proofErr w:type="spellStart"/>
+            <w:r>
+              <w:rPr>
+                <w:rFonts w:ascii="Times New Roman" w:hAnsi="Times New Roman"/>
+                <w:color w:val="000000"/>
+              </w:rPr>
+              <w:t>pangkat</w:t>
+            </w:r>
+            <w:proofErr w:type="spellEnd"/>
           </w:p>
           <w:p>
             <w:pPr>
@@ -6621,8 +7725,17 @@
                 <w:rFonts w:ascii="Times New Roman" w:hAnsi="Times New Roman"/>
                 <w:color w:val="000000"/>
               </w:rPr>
-              <w:t>$pangkatjabat</w:t>
-            </w:r>
+              <w:t>$</w:t>
+            </w:r>
+            <w:proofErr w:type="spellStart"/>
+            <w:r>
+              <w:rPr>
+                <w:rFonts w:ascii="Times New Roman" w:hAnsi="Times New Roman"/>
+                <w:color w:val="000000"/>
+              </w:rPr>
+              <w:t>pangkatjabat</w:t>
+            </w:r>
+            <w:proofErr w:type="spellEnd"/>
           </w:p>
         </w:tc>
       </w:tr>
@@ -6663,12 +7776,28 @@
                 <w:lang w:val="id-ID"/>
               </w:rPr>
             </w:pPr>
-            <w:r>
-              <w:rPr>
-                <w:rFonts w:ascii="Times New Roman" w:hAnsi="Times New Roman"/>
-              </w:rPr>
-              <w:t>Maksud Perjalanan</w:t>
-            </w:r>
+            <w:proofErr w:type="spellStart"/>
+            <w:r>
+              <w:rPr>
+                <w:rFonts w:ascii="Times New Roman" w:hAnsi="Times New Roman"/>
+              </w:rPr>
+              <w:t>Maksud</w:t>
+            </w:r>
+            <w:proofErr w:type="spellEnd"/>
+            <w:r>
+              <w:rPr>
+                <w:rFonts w:ascii="Times New Roman" w:hAnsi="Times New Roman"/>
+              </w:rPr>
+              <w:t xml:space="preserve"> </w:t>
+            </w:r>
+            <w:proofErr w:type="spellStart"/>
+            <w:r>
+              <w:rPr>
+                <w:rFonts w:ascii="Times New Roman" w:hAnsi="Times New Roman"/>
+              </w:rPr>
+              <w:t>Perjalanan</w:t>
+            </w:r>
+            <w:proofErr w:type="spellEnd"/>
             <w:r>
               <w:rPr>
                 <w:rFonts w:ascii="Times New Roman" w:hAnsi="Times New Roman"/>
@@ -7186,7 +8315,35 @@
               <w:rPr>
                 <w:rFonts w:ascii="Times New Roman" w:hAnsi="Times New Roman"/>
               </w:rPr>
-              <w:t>$totalhari ( default 1 hari )</w:t>
+              <w:t>$</w:t>
+            </w:r>
+            <w:proofErr w:type="spellStart"/>
+            <w:r>
+              <w:rPr>
+                <w:rFonts w:ascii="Times New Roman" w:hAnsi="Times New Roman"/>
+              </w:rPr>
+              <w:t>totalhari</w:t>
+            </w:r>
+            <w:proofErr w:type="spellEnd"/>
+            <w:r>
+              <w:rPr>
+                <w:rFonts w:ascii="Times New Roman" w:hAnsi="Times New Roman"/>
+              </w:rPr>
+              <w:t xml:space="preserve"> ( default 1 </w:t>
+            </w:r>
+            <w:proofErr w:type="spellStart"/>
+            <w:r>
+              <w:rPr>
+                <w:rFonts w:ascii="Times New Roman" w:hAnsi="Times New Roman"/>
+              </w:rPr>
+              <w:t>hari</w:t>
+            </w:r>
+            <w:proofErr w:type="spellEnd"/>
+            <w:r>
+              <w:rPr>
+                <w:rFonts w:ascii="Times New Roman" w:hAnsi="Times New Roman"/>
+              </w:rPr>
+              <w:t xml:space="preserve"> )</w:t>
             </w:r>
           </w:p>
           <w:p>
@@ -7201,8 +8358,16 @@
               <w:rPr>
                 <w:rFonts w:ascii="Times New Roman" w:hAnsi="Times New Roman"/>
               </w:rPr>
-              <w:t>$tanggal</w:t>
-            </w:r>
+              <w:t>$</w:t>
+            </w:r>
+            <w:proofErr w:type="spellStart"/>
+            <w:r>
+              <w:rPr>
+                <w:rFonts w:ascii="Times New Roman" w:hAnsi="Times New Roman"/>
+              </w:rPr>
+              <w:t>tanggal</w:t>
+            </w:r>
+            <w:proofErr w:type="spellEnd"/>
           </w:p>
           <w:p>
             <w:pPr>
@@ -7216,8 +8381,16 @@
               <w:rPr>
                 <w:rFonts w:ascii="Times New Roman" w:hAnsi="Times New Roman"/>
               </w:rPr>
-              <w:t>$tanggalselesai</w:t>
-            </w:r>
+              <w:t>$</w:t>
+            </w:r>
+            <w:proofErr w:type="spellStart"/>
+            <w:r>
+              <w:rPr>
+                <w:rFonts w:ascii="Times New Roman" w:hAnsi="Times New Roman"/>
+              </w:rPr>
+              <w:t>tanggalselesai</w:t>
+            </w:r>
+            <w:proofErr w:type="spellEnd"/>
           </w:p>
           <w:p>
             <w:pPr>
@@ -7818,50 +8991,29 @@
         <w:ind w:left="5041" w:firstLine="720"/>
         <w:rPr>
           <w:rFonts w:ascii="Times New Roman" w:hAnsi="Times New Roman"/>
+        </w:rPr>
+      </w:pPr>
+      <w:r>
+        <w:rPr>
+          <w:rFonts w:ascii="Times New Roman" w:hAnsi="Times New Roman"/>
           <w:lang w:val="id-ID"/>
         </w:rPr>
-      </w:pPr>
-      <w:r>
-        <w:rPr>
-          <w:rFonts w:ascii="Times New Roman" w:hAnsi="Times New Roman"/>
-          <w:lang w:val="id-ID"/>
-        </w:rPr>
-        <w:t>Turen,  1</w:t>
-      </w:r>
-      <w:r>
-        <w:rPr>
-          <w:rFonts w:ascii="Times New Roman" w:hAnsi="Times New Roman"/>
-          <w:lang w:val="id-ID"/>
-        </w:rPr>
-        <w:t>8</w:t>
-      </w:r>
-      <w:r>
-        <w:rPr>
-          <w:rFonts w:ascii="Times New Roman" w:hAnsi="Times New Roman"/>
-          <w:lang w:val="id-ID"/>
-        </w:rPr>
-        <w:t xml:space="preserve"> </w:t>
-      </w:r>
-      <w:r>
-        <w:rPr>
-          <w:rFonts w:ascii="Times New Roman" w:hAnsi="Times New Roman"/>
-          <w:lang w:val="id-ID"/>
-        </w:rPr>
-        <w:t xml:space="preserve">Juli </w:t>
-      </w:r>
-      <w:r>
-        <w:rPr>
-          <w:rFonts w:ascii="Times New Roman" w:hAnsi="Times New Roman"/>
-        </w:rPr>
-        <w:t>202</w:t>
-      </w:r>
-      <w:r>
-        <w:rPr>
-          <w:rFonts w:ascii="Times New Roman" w:hAnsi="Times New Roman"/>
-          <w:lang w:val="id-ID"/>
-        </w:rPr>
-        <w:t>6</w:t>
-      </w:r>
+        <w:t xml:space="preserve">Turen,  </w:t>
+      </w:r>
+      <w:r>
+        <w:rPr>
+          <w:rFonts w:ascii="Times New Roman" w:hAnsi="Times New Roman"/>
+        </w:rPr>
+        <w:t>$</w:t>
+      </w:r>
+      <w:proofErr w:type="spellStart"/>
+      <w:r>
+        <w:rPr>
+          <w:rFonts w:ascii="Times New Roman" w:hAnsi="Times New Roman"/>
+        </w:rPr>
+        <w:t>tanggal</w:t>
+      </w:r>
+      <w:proofErr w:type="spellEnd"/>
     </w:p>
     <w:p>
       <w:pPr>
@@ -9602,7 +10754,6 @@
     <w:uiPriority w:val="99"/>
     <w:semiHidden/>
     <w:unhideWhenUsed/>
-    <w:qFormat/>
     <w:tblPr>
       <w:tblInd w:w="0" w:type="dxa"/>
       <w:tblCellMar>

</xml_diff>

<commit_message>
Perbaiki tabel Kepada di template SPPD: hapus kolon ganda di baris NIP/Pangkat/Jabatan/Unit Kerja (sekarang cuma 1 kolon per baris), ubah label jadi huruf kecil (nama, pangkat/golongan, jabatan, unit kerja) kecuali NIP yang tetap kapital karena singkatan.
</commit_message>
<xml_diff>
--- a/resources/templates/sppd_template.docx
+++ b/resources/templates/sppd_template.docx
@@ -1072,7 +1072,7 @@
                 <w:sz w:val="24"/>
                 <w:szCs w:val="24"/>
               </w:rPr>
-              <w:t>Nama</w:t>
+              <w:t>nama</w:t>
             </w:r>
           </w:p>
         </w:tc>
@@ -1168,7 +1168,6 @@
                 <w:sz w:val="24"/>
                 <w:szCs w:val="24"/>
               </w:rPr>
-              <w:t>:</w:t>
             </w:r>
           </w:p>
         </w:tc>
@@ -1277,7 +1276,6 @@
                 <w:sz w:val="24"/>
                 <w:szCs w:val="24"/>
               </w:rPr>
-              <w:t>:</w:t>
             </w:r>
           </w:p>
         </w:tc>
@@ -1301,7 +1299,7 @@
                 <w:sz w:val="24"/>
                 <w:szCs w:val="24"/>
               </w:rPr>
-              <w:t>Pangkat</w:t>
+              <w:t>pangkat</w:t>
             </w:r>
             <w:proofErr w:type="spellEnd"/>
             <w:r>
@@ -1416,7 +1414,6 @@
                 <w:sz w:val="24"/>
                 <w:szCs w:val="24"/>
               </w:rPr>
-              <w:t>:</w:t>
             </w:r>
           </w:p>
         </w:tc>
@@ -1440,7 +1437,7 @@
                 <w:sz w:val="24"/>
                 <w:szCs w:val="24"/>
               </w:rPr>
-              <w:t>Jabatan</w:t>
+              <w:t>jabatan</w:t>
             </w:r>
             <w:proofErr w:type="spellEnd"/>
           </w:p>
@@ -1537,7 +1534,6 @@
                 <w:sz w:val="24"/>
                 <w:szCs w:val="24"/>
               </w:rPr>
-              <w:t>:</w:t>
             </w:r>
           </w:p>
         </w:tc>
@@ -1560,7 +1556,7 @@
                 <w:sz w:val="24"/>
                 <w:szCs w:val="24"/>
               </w:rPr>
-              <w:t xml:space="preserve">Unit </w:t>
+              <w:t xml:space="preserve">unit </w:t>
             </w:r>
             <w:proofErr w:type="spellStart"/>
             <w:r>

</xml_diff>

<commit_message>
1) Fix template: hapus tanda kurung & teks ganda 'atau/selesai' di bagian Untuk - sekarang bersih 's.d. selesai' atau 's.d. [jam]'. 2) Total Hari dihitung otomatis dari selisih tanggal berangkat-kembali (dijamin valid), hapus input manual. 3) Nomor Surat sekarang cukup isi 2 kotak (kode umum + nomor urut, auto-suggest nomor urut terbesar+1), bagian belakang (kode baku+tahun) otomatis - reuse logika SuratKeluar::susunKode().
</commit_message>
<xml_diff>
--- a/resources/templates/sppd_template.docx
+++ b/resources/templates/sppd_template.docx
@@ -1868,7 +1868,7 @@
                 <w:sz w:val="24"/>
                 <w:szCs w:val="24"/>
               </w:rPr>
-              <w:t xml:space="preserve"> ( $</w:t>
+              <w:t xml:space="preserve"> $</w:t>
             </w:r>
             <w:proofErr w:type="spellStart"/>
             <w:r>
@@ -1895,7 +1895,6 @@
                 <w:sz w:val="24"/>
                 <w:szCs w:val="24"/>
               </w:rPr>
-              <w:t>atau</w:t>
             </w:r>
             <w:proofErr w:type="spellEnd"/>
             <w:r>
@@ -1904,7 +1903,6 @@
                 <w:sz w:val="24"/>
                 <w:szCs w:val="24"/>
               </w:rPr>
-              <w:t xml:space="preserve"> / </w:t>
             </w:r>
             <w:proofErr w:type="spellStart"/>
             <w:r>
@@ -1913,7 +1911,6 @@
                 <w:sz w:val="24"/>
                 <w:szCs w:val="24"/>
               </w:rPr>
-              <w:t>selesai</w:t>
             </w:r>
             <w:proofErr w:type="spellEnd"/>
             <w:r>
@@ -1922,7 +1919,6 @@
                 <w:sz w:val="24"/>
                 <w:szCs w:val="24"/>
               </w:rPr>
-              <w:t xml:space="preserve">) </w:t>
             </w:r>
             <w:proofErr w:type="spellStart"/>
             <w:r>

</xml_diff>

<commit_message>
Ubah 'dengan tema $tema .' jadi 'dalam kegiatan "$tema".' di template SPPD
</commit_message>
<xml_diff>
--- a/resources/templates/sppd_template.docx
+++ b/resources/templates/sppd_template.docx
@@ -1973,7 +1973,7 @@
                 <w:sz w:val="24"/>
                 <w:szCs w:val="24"/>
               </w:rPr>
-              <w:t>dengan</w:t>
+              <w:t>dalam</w:t>
             </w:r>
             <w:proofErr w:type="spellEnd"/>
             <w:r>
@@ -1991,6 +1991,24 @@
                 <w:sz w:val="24"/>
                 <w:szCs w:val="24"/>
               </w:rPr>
+              <w:t>kegiatan "</w:t>
+            </w:r>
+            <w:proofErr w:type="spellEnd"/>
+            <w:r>
+              <w:rPr>
+                <w:rFonts w:ascii="Times New Roman" w:hAnsi="Times New Roman"/>
+                <w:sz w:val="24"/>
+                <w:szCs w:val="24"/>
+              </w:rPr>
+              <w:t>$</w:t>
+            </w:r>
+            <w:proofErr w:type="spellStart"/>
+            <w:r>
+              <w:rPr>
+                <w:rFonts w:ascii="Times New Roman" w:hAnsi="Times New Roman"/>
+                <w:sz w:val="24"/>
+                <w:szCs w:val="24"/>
+              </w:rPr>
               <w:t>tema</w:t>
             </w:r>
             <w:proofErr w:type="spellEnd"/>
@@ -2000,25 +2018,7 @@
                 <w:sz w:val="24"/>
                 <w:szCs w:val="24"/>
               </w:rPr>
-              <w:t xml:space="preserve"> $</w:t>
-            </w:r>
-            <w:proofErr w:type="spellStart"/>
-            <w:r>
-              <w:rPr>
-                <w:rFonts w:ascii="Times New Roman" w:hAnsi="Times New Roman"/>
-                <w:sz w:val="24"/>
-                <w:szCs w:val="24"/>
-              </w:rPr>
-              <w:t>tema</w:t>
-            </w:r>
-            <w:proofErr w:type="spellEnd"/>
-            <w:r>
-              <w:rPr>
-                <w:rFonts w:ascii="Times New Roman" w:hAnsi="Times New Roman"/>
-                <w:sz w:val="24"/>
-                <w:szCs w:val="24"/>
-              </w:rPr>
-              <w:t xml:space="preserve"> . </w:t>
+              <w:t>".</w:t>
             </w:r>
           </w:p>
           <w:p>

</xml_diff>